<commit_message>
Doc chapitres manquant rajouter manque UML
</commit_message>
<xml_diff>
--- a/documentation/3_Documentation_Projet.docx
+++ b/documentation/3_Documentation_Projet.docx
@@ -284,33 +284,11 @@
         </w:rPr>
         <w:t xml:space="preserve"> </w:t>
       </w:r>
-      <w:proofErr w:type="spellStart"/>
-      <w:r>
-        <w:rPr>
-          <w:lang w:val="fr-CH"/>
-        </w:rPr>
-        <w:t>Bardy</w:t>
-      </w:r>
-      <w:proofErr w:type="spellEnd"/>
-      <w:r>
-        <w:rPr>
-          <w:lang w:val="fr-CH"/>
-        </w:rPr>
-        <w:t xml:space="preserve"> Maxime, Hohl Cyril, </w:t>
-      </w:r>
-      <w:proofErr w:type="spellStart"/>
-      <w:r>
-        <w:rPr>
-          <w:lang w:val="fr-CH"/>
-        </w:rPr>
-        <w:t>Kolly</w:t>
-      </w:r>
-      <w:proofErr w:type="spellEnd"/>
-      <w:r>
-        <w:rPr>
-          <w:lang w:val="fr-CH"/>
-        </w:rPr>
-        <w:t xml:space="preserve"> Romain, Lefort Julie</w:t>
+      <w:r>
+        <w:rPr>
+          <w:lang w:val="fr-CH"/>
+        </w:rPr>
+        <w:t>Bardy Maxime, Hohl Cyril, Kolly Romain, Lefort Julie</w:t>
       </w:r>
     </w:p>
     <w:p>
@@ -3241,13 +3219,8 @@
         </w:numPr>
         <w:ind w:left="1701" w:hanging="425"/>
       </w:pPr>
-      <w:proofErr w:type="spellStart"/>
-      <w:r>
-        <w:t>Perte</w:t>
-      </w:r>
-      <w:proofErr w:type="spellEnd"/>
-      <w:r>
-        <w:t xml:space="preserve"> de </w:t>
+      <w:r>
+        <w:t xml:space="preserve">Perte de </w:t>
       </w:r>
       <w:proofErr w:type="spellStart"/>
       <w:r>
@@ -3282,14 +3255,9 @@
         </w:numPr>
         <w:ind w:left="1701" w:hanging="425"/>
       </w:pPr>
-      <w:proofErr w:type="spellStart"/>
       <w:r>
         <w:lastRenderedPageBreak/>
-        <w:t>Choc</w:t>
-      </w:r>
-      <w:proofErr w:type="spellEnd"/>
-      <w:r>
-        <w:t xml:space="preserve"> </w:t>
+        <w:t xml:space="preserve">Choc </w:t>
       </w:r>
       <w:proofErr w:type="spellStart"/>
       <w:r>
@@ -3636,13 +3604,8 @@
         </w:numPr>
         <w:ind w:left="1701" w:hanging="425"/>
       </w:pPr>
-      <w:proofErr w:type="spellStart"/>
-      <w:r>
-        <w:t>Présence</w:t>
-      </w:r>
-      <w:proofErr w:type="spellEnd"/>
-      <w:r>
-        <w:t xml:space="preserve"> </w:t>
+      <w:r>
+        <w:t xml:space="preserve">Présence </w:t>
       </w:r>
       <w:proofErr w:type="spellStart"/>
       <w:r>
@@ -3947,6 +3910,107 @@
     </w:p>
     <w:p>
       <w:pPr>
+        <w:pStyle w:val="NormalWeb"/>
+        <w:rPr>
+          <w:rFonts w:ascii="Arial" w:hAnsi="Arial" w:cs="Arial"/>
+          <w:lang w:eastAsia="en-US"/>
+        </w:rPr>
+      </w:pPr>
+      <w:r>
+        <w:rPr>
+          <w:rFonts w:ascii="Arial" w:hAnsi="Arial" w:cs="Arial"/>
+        </w:rPr>
+        <w:t xml:space="preserve">La réalisation s’est faite en priorisant la fiabilité du pilotage et la sécurité d’utilisation. L’application cliente (Java) assure la connexion au rover via Phidget Network, puis traduit les entrées de la manette Xbox en commandes moteurs (vitesse gauche/droite) avec une logique de sécurité (arrêt immédiat et reconnexion). Le bouton d’arrêt d’urgence coupe instantanément </w:t>
+      </w:r>
+      <w:proofErr w:type="gramStart"/>
+      <w:r>
+        <w:rPr>
+          <w:rFonts w:ascii="Arial" w:hAnsi="Arial" w:cs="Arial"/>
+        </w:rPr>
+        <w:t>la commande moteur</w:t>
+      </w:r>
+      <w:proofErr w:type="gramEnd"/>
+      <w:r>
+        <w:rPr>
+          <w:rFonts w:ascii="Arial" w:hAnsi="Arial" w:cs="Arial"/>
+        </w:rPr>
+        <w:t>, et en cas de perte de liaison (manette ou rover), l’application force un stop et tente une reconnexion périodique.</w:t>
+      </w:r>
+    </w:p>
+    <w:p>
+      <w:pPr>
+        <w:pStyle w:val="NormalWeb"/>
+        <w:rPr>
+          <w:rFonts w:ascii="Arial" w:hAnsi="Arial" w:cs="Arial"/>
+        </w:rPr>
+      </w:pPr>
+      <w:proofErr w:type="gramStart"/>
+      <w:r>
+        <w:rPr>
+          <w:rFonts w:ascii="Arial" w:hAnsi="Arial" w:cs="Arial"/>
+        </w:rPr>
+        <w:t>Suite aux</w:t>
+      </w:r>
+      <w:proofErr w:type="gramEnd"/>
+      <w:r>
+        <w:rPr>
+          <w:rFonts w:ascii="Arial" w:hAnsi="Arial" w:cs="Arial"/>
+        </w:rPr>
+        <w:t xml:space="preserve"> contraintes matérielles rencontrées, certaines exigences initiales ont été adaptées : la vidéo live a été remplacée par un sonar de distance, et l’éclairage a été remplacé par un capteur de luminosité. L’objectif est de fournir une compensation exploitable en grotte : détection d’obstacles à courte portée, retour d’informations environnementales (température, humidité, luminosité) et affichage d’un fil d’Ariane (position approximative basée sur le cumul des mouvements). Les données capteurs sont rafraîchies en continu et stockées afin de générer un rapport de mission automatique.</w:t>
+      </w:r>
+    </w:p>
+    <w:p>
+      <w:pPr>
+        <w:pStyle w:val="NormalWeb"/>
+        <w:rPr>
+          <w:rFonts w:ascii="Arial" w:hAnsi="Arial" w:cs="Arial"/>
+        </w:rPr>
+      </w:pPr>
+      <w:r>
+        <w:rPr>
+          <w:rFonts w:ascii="Arial" w:hAnsi="Arial" w:cs="Arial"/>
+        </w:rPr>
+        <w:t>Enfin, la réalisation a été structurée pour isoler le matériel du reste du code : services dédiés (connexion moteurs, sonar, capteurs) et diffusion d’états simples vers l’interface. Cette séparation permet de diagnostiquer rapidement les pannes (</w:t>
+      </w:r>
+      <w:proofErr w:type="spellStart"/>
+      <w:r>
+        <w:rPr>
+          <w:rFonts w:ascii="Arial" w:hAnsi="Arial" w:cs="Arial"/>
+        </w:rPr>
+        <w:t>hubPort</w:t>
+      </w:r>
+      <w:proofErr w:type="spellEnd"/>
+      <w:r>
+        <w:rPr>
+          <w:rFonts w:ascii="Arial" w:hAnsi="Arial" w:cs="Arial"/>
+        </w:rPr>
+        <w:t xml:space="preserve">, </w:t>
+      </w:r>
+      <w:proofErr w:type="spellStart"/>
+      <w:r>
+        <w:rPr>
+          <w:rFonts w:ascii="Arial" w:hAnsi="Arial" w:cs="Arial"/>
+        </w:rPr>
+        <w:t>channel</w:t>
+      </w:r>
+      <w:proofErr w:type="spellEnd"/>
+      <w:r>
+        <w:rPr>
+          <w:rFonts w:ascii="Arial" w:hAnsi="Arial" w:cs="Arial"/>
+        </w:rPr>
+        <w:t>, paramètres réseau) et de remplacer un capteur sans impacter l’UI ni la logique métier.</w:t>
+      </w:r>
+    </w:p>
+    <w:p>
+      <w:pPr>
+        <w:pStyle w:val="BITTextkrper"/>
+        <w:rPr>
+          <w:lang w:val="fr-CH"/>
+        </w:rPr>
+      </w:pPr>
+    </w:p>
+    <w:p>
+      <w:pPr>
         <w:pStyle w:val="Titre2"/>
         <w:tabs>
           <w:tab w:val="clear" w:pos="851"/>
@@ -4056,71 +4120,246 @@
         <w:rPr>
           <w:lang w:val="fr-CH"/>
         </w:rPr>
-        <w:t xml:space="preserve">Maxime </w:t>
+        <w:t>Maxime Bardy : Product Owner</w:t>
+      </w:r>
+    </w:p>
+    <w:p>
+      <w:pPr>
+        <w:pStyle w:val="BITTextkrper"/>
+        <w:rPr>
+          <w:lang w:val="fr-CH"/>
+        </w:rPr>
+      </w:pPr>
+      <w:r>
+        <w:rPr>
+          <w:lang w:val="fr-CH"/>
+        </w:rPr>
+        <w:t>Julie Lefort : SCRUM Master</w:t>
+      </w:r>
+    </w:p>
+    <w:p>
+      <w:pPr>
+        <w:pStyle w:val="BITTextkrper"/>
+        <w:rPr>
+          <w:lang w:val="fr-CH"/>
+        </w:rPr>
+      </w:pPr>
+      <w:r>
+        <w:rPr>
+          <w:lang w:val="fr-CH"/>
+        </w:rPr>
+        <w:t>Romain Kolly : Développeur</w:t>
+      </w:r>
+    </w:p>
+    <w:p>
+      <w:pPr>
+        <w:pStyle w:val="BITTextkrper"/>
+        <w:rPr>
+          <w:lang w:val="fr-CH"/>
+        </w:rPr>
+      </w:pPr>
+      <w:r>
+        <w:rPr>
+          <w:lang w:val="fr-CH"/>
+        </w:rPr>
+        <w:t>Cyril Hohl : Développeur</w:t>
+      </w:r>
+    </w:p>
+    <w:p>
+      <w:pPr>
+        <w:pStyle w:val="Titre3"/>
+      </w:pPr>
+      <w:r>
+        <w:t>Sauvegardes</w:t>
+      </w:r>
+    </w:p>
+    <w:p>
+      <w:pPr>
+        <w:pStyle w:val="BITTextkrper"/>
+        <w:rPr>
+          <w:lang w:val="en-US"/>
+        </w:rPr>
+      </w:pPr>
+      <w:r>
+        <w:rPr>
+          <w:lang w:val="fr-CH"/>
+        </w:rPr>
+        <w:t xml:space="preserve">La sauvegarde du projet repose sur Git comme source de vérité. Le dépôt contient le code, la documentation et les ressources nécessaires pour reconstruire l’environnement. Chaque </w:t>
+      </w:r>
+      <w:r>
+        <w:rPr>
+          <w:lang w:val="fr-CH"/>
+        </w:rPr>
+        <w:lastRenderedPageBreak/>
+        <w:t xml:space="preserve">fonctionnalité importante est développée sur une branche dédiée, puis fusionnée sur la branche principale après validation (compilation, tests manuels minimaux, et vérification que le rover peut être stoppé en toute circonstance). Les </w:t>
       </w:r>
       <w:proofErr w:type="spellStart"/>
       <w:r>
         <w:rPr>
           <w:lang w:val="fr-CH"/>
         </w:rPr>
-        <w:t>Bardy</w:t>
+        <w:t>commits</w:t>
       </w:r>
       <w:proofErr w:type="spellEnd"/>
       <w:r>
         <w:rPr>
           <w:lang w:val="fr-CH"/>
         </w:rPr>
-        <w:t xml:space="preserve"> : Product </w:t>
+        <w:t xml:space="preserve"> sont atomiques et décrivent clairement le changement (ex. </w:t>
+      </w:r>
+      <w:r>
+        <w:rPr>
+          <w:lang w:val="en-US"/>
+        </w:rPr>
+        <w:t>“add sonar state publish”, “fix emergency stop logic”, “update documentation”).</w:t>
+      </w:r>
+    </w:p>
+    <w:p>
+      <w:pPr>
+        <w:pStyle w:val="BITTextkrper"/>
+        <w:rPr>
+          <w:lang w:val="fr-CH"/>
+        </w:rPr>
+      </w:pPr>
+      <w:r>
+        <w:rPr>
+          <w:lang w:val="fr-CH"/>
+        </w:rPr>
+        <w:t>En complément, une stratégie de sauvegarde “défense en profondeur” est appliquée :</w:t>
+      </w:r>
+    </w:p>
+    <w:p>
+      <w:pPr>
+        <w:pStyle w:val="BITTextkrper"/>
+        <w:numPr>
+          <w:ilvl w:val="0"/>
+          <w:numId w:val="14"/>
+        </w:numPr>
+        <w:rPr>
+          <w:lang w:val="fr-CH"/>
+        </w:rPr>
+      </w:pPr>
+      <w:proofErr w:type="gramStart"/>
+      <w:r>
+        <w:rPr>
+          <w:lang w:val="fr-CH"/>
+        </w:rPr>
+        <w:t>dépôt</w:t>
+      </w:r>
+      <w:proofErr w:type="gramEnd"/>
+      <w:r>
+        <w:rPr>
+          <w:lang w:val="fr-CH"/>
+        </w:rPr>
+        <w:t xml:space="preserve"> Git distant (</w:t>
       </w:r>
       <w:proofErr w:type="spellStart"/>
       <w:r>
         <w:rPr>
           <w:lang w:val="fr-CH"/>
         </w:rPr>
-        <w:t>Owner</w:t>
+        <w:t>remote</w:t>
       </w:r>
       <w:proofErr w:type="spellEnd"/>
+      <w:r>
+        <w:rPr>
+          <w:lang w:val="fr-CH"/>
+        </w:rPr>
+        <w:t>) = sauvegarde principale ;</w:t>
+      </w:r>
     </w:p>
     <w:p>
       <w:pPr>
         <w:pStyle w:val="BITTextkrper"/>
-        <w:rPr>
-          <w:lang w:val="fr-CH"/>
-        </w:rPr>
-      </w:pPr>
-      <w:r>
-        <w:rPr>
-          <w:lang w:val="fr-CH"/>
-        </w:rPr>
-        <w:t>Julie Lefort : SCRUM Master</w:t>
+        <w:numPr>
+          <w:ilvl w:val="0"/>
+          <w:numId w:val="14"/>
+        </w:numPr>
+        <w:rPr>
+          <w:lang w:val="fr-CH"/>
+        </w:rPr>
+      </w:pPr>
+      <w:proofErr w:type="gramStart"/>
+      <w:r>
+        <w:rPr>
+          <w:lang w:val="fr-CH"/>
+        </w:rPr>
+        <w:t>export</w:t>
+      </w:r>
+      <w:proofErr w:type="gramEnd"/>
+      <w:r>
+        <w:rPr>
+          <w:lang w:val="fr-CH"/>
+        </w:rPr>
+        <w:t xml:space="preserve"> régulier du rapport et des documents (PDF/Word) dans un dossier “archives” versionné ;</w:t>
       </w:r>
     </w:p>
     <w:p>
       <w:pPr>
         <w:pStyle w:val="BITTextkrper"/>
-        <w:rPr>
-          <w:lang w:val="fr-CH"/>
-        </w:rPr>
-      </w:pPr>
-      <w:r>
-        <w:rPr>
-          <w:lang w:val="fr-CH"/>
-        </w:rPr>
-        <w:t xml:space="preserve">Romain </w:t>
+        <w:numPr>
+          <w:ilvl w:val="0"/>
+          <w:numId w:val="14"/>
+        </w:numPr>
+        <w:rPr>
+          <w:lang w:val="fr-CH"/>
+        </w:rPr>
+      </w:pPr>
+      <w:proofErr w:type="gramStart"/>
+      <w:r>
+        <w:rPr>
+          <w:lang w:val="fr-CH"/>
+        </w:rPr>
+        <w:t>sauvegarde</w:t>
+      </w:r>
+      <w:proofErr w:type="gramEnd"/>
+      <w:r>
+        <w:rPr>
+          <w:lang w:val="fr-CH"/>
+        </w:rPr>
+        <w:t xml:space="preserve"> locale automatique (cloud/OneDrive/partage école) du dossier projet pour prévenir la perte de données </w:t>
+      </w:r>
+      <w:proofErr w:type="gramStart"/>
+      <w:r>
+        <w:rPr>
+          <w:lang w:val="fr-CH"/>
+        </w:rPr>
+        <w:t>hors</w:t>
+      </w:r>
+      <w:proofErr w:type="gramEnd"/>
+      <w:r>
+        <w:rPr>
+          <w:lang w:val="fr-CH"/>
+        </w:rPr>
+        <w:t xml:space="preserve"> Git (ex. documents en cours de rédaction).</w:t>
+      </w:r>
+    </w:p>
+    <w:p>
+      <w:pPr>
+        <w:pStyle w:val="BITTextkrper"/>
+        <w:rPr>
+          <w:lang w:val="fr-CH"/>
+        </w:rPr>
+      </w:pPr>
+      <w:r>
+        <w:rPr>
+          <w:lang w:val="fr-CH"/>
+        </w:rPr>
+        <w:t xml:space="preserve">Les configurations sensibles au matériel (IP du hub, </w:t>
       </w:r>
       <w:proofErr w:type="spellStart"/>
       <w:r>
         <w:rPr>
           <w:lang w:val="fr-CH"/>
         </w:rPr>
-        <w:t>Kolly</w:t>
+        <w:t>hubPort</w:t>
       </w:r>
       <w:proofErr w:type="spellEnd"/>
       <w:r>
         <w:rPr>
           <w:lang w:val="fr-CH"/>
         </w:rPr>
-        <w:t> : Développeur</w:t>
+        <w:t xml:space="preserve"> moteurs/sonar, channels) sont centralisées et documentées afin d’éviter une perte de connaissance lors d’un changement de poste ou d’un remplacement de rover.</w:t>
       </w:r>
     </w:p>
     <w:p>
@@ -4130,20 +4369,6 @@
           <w:lang w:val="fr-CH"/>
         </w:rPr>
       </w:pPr>
-      <w:r>
-        <w:rPr>
-          <w:lang w:val="fr-CH"/>
-        </w:rPr>
-        <w:t>Cyril Hohl : Développeur</w:t>
-      </w:r>
-    </w:p>
-    <w:p>
-      <w:pPr>
-        <w:pStyle w:val="Titre3"/>
-      </w:pPr>
-      <w:r>
-        <w:t>Sauvegardes</w:t>
-      </w:r>
     </w:p>
     <w:p>
       <w:pPr>
@@ -4189,24 +4414,54 @@
     </w:p>
     <w:p>
       <w:pPr>
-        <w:rPr>
-          <w:lang w:val="fr-CH"/>
-        </w:rPr>
-      </w:pPr>
-      <w:r>
-        <w:rPr>
-          <w:lang w:val="fr-CH"/>
-        </w:rPr>
-        <w:t xml:space="preserve">Résumé de l’état actuel </w:t>
-      </w:r>
-      <w:proofErr w:type="spellStart"/>
-      <w:r>
-        <w:rPr>
-          <w:lang w:val="fr-CH"/>
-        </w:rPr>
-        <w:t>avant projet</w:t>
-      </w:r>
-      <w:proofErr w:type="spellEnd"/>
+        <w:pStyle w:val="NormalWeb"/>
+        <w:rPr>
+          <w:rFonts w:ascii="Arial" w:hAnsi="Arial" w:cs="Arial"/>
+          <w:lang w:eastAsia="en-US"/>
+        </w:rPr>
+      </w:pPr>
+      <w:r>
+        <w:rPr>
+          <w:rFonts w:ascii="Arial" w:hAnsi="Arial" w:cs="Arial"/>
+        </w:rPr>
+        <w:t>Avant le projet, la reconnaissance des premiers mètres d’une grotte se faisait sans support technique permettant de réduire le risque : l’explorateur ne dispose pas d’une visibilité fiable sur l’état du passage (obstacle proche, rétrécissement, chute, zone instable) et s’expose dès l’entrée à une situation imprévue. Il n’existait pas non plus d’outil simple pour collecter et centraliser des données environnementales (température, humidité, luminosité) pendant une pré-exploration.</w:t>
+      </w:r>
+    </w:p>
+    <w:p>
+      <w:pPr>
+        <w:pStyle w:val="NormalWeb"/>
+        <w:rPr>
+          <w:rFonts w:ascii="Arial" w:hAnsi="Arial" w:cs="Arial"/>
+        </w:rPr>
+      </w:pPr>
+      <w:r>
+        <w:rPr>
+          <w:rFonts w:ascii="Arial" w:hAnsi="Arial" w:cs="Arial"/>
+        </w:rPr>
+        <w:t>Côté matériel, un kit rover était disponible, mais sans application de pilotage répondant à des exigences de sécurité : pas d’arrêt d’urgence intégré, pas de gestion robuste de la connexion, et pas d’interface unifiée affichant la télémétrie. Certaines fonctions envisagées (caméra/vidéo live, éclairage, mode “crabe”) dépendaient fortement du matériel effectivement disponible et se sont révélées difficilement réalisables dans le cadre du temps et des contraintes du robot.</w:t>
+      </w:r>
+    </w:p>
+    <w:p>
+      <w:pPr>
+        <w:pStyle w:val="NormalWeb"/>
+        <w:rPr>
+          <w:rFonts w:ascii="Arial" w:hAnsi="Arial" w:cs="Arial"/>
+        </w:rPr>
+      </w:pPr>
+      <w:r>
+        <w:rPr>
+          <w:rFonts w:ascii="Arial" w:hAnsi="Arial" w:cs="Arial"/>
+        </w:rPr>
+        <w:t>Enfin, l’état initial impliquait une incertitude sur la faisabilité : compatibilité des capteurs, stabilité de la liaison, et capacité à fournir un retour utilisateur utile même sans vidéo. Le projet devait donc transformer un rover “pilotable en théorie” en un système exploitable, orienté sécurité, diagnostic et simplicité de prise en main.</w:t>
+      </w:r>
+    </w:p>
+    <w:p>
+      <w:pPr>
+        <w:pStyle w:val="BITTextkrper"/>
+        <w:rPr>
+          <w:lang w:val="fr-CH"/>
+        </w:rPr>
+      </w:pPr>
     </w:p>
     <w:p>
       <w:pPr>
@@ -4222,16 +4477,194 @@
     </w:p>
     <w:p>
       <w:pPr>
-        <w:rPr>
-          <w:lang w:val="fr-CH"/>
-        </w:rPr>
-      </w:pPr>
-      <w:r>
-        <w:rPr>
-          <w:lang w:val="fr-CH"/>
-        </w:rPr>
-        <w:t>Résumé de l’état désiré</w:t>
-      </w:r>
+        <w:pStyle w:val="BITTextkrper"/>
+        <w:rPr>
+          <w:lang w:val="fr-CH"/>
+        </w:rPr>
+      </w:pPr>
+      <w:r>
+        <w:rPr>
+          <w:lang w:val="fr-CH"/>
+        </w:rPr>
+        <w:t>L’état désiré est un système de pré-exploration utilisable rapidement par un utilisateur novice, avec une logique de sécurité prioritaire. L’application doit permettre une connexion automatique (manette + rover), un pilotage fluide et précis, et un arrêt d’urgence immédiat et fiable. En cas de perte de signal (manette ou rover), le comportement attendu est un arrêt automatique, puis une tentative de reconnexion contrôlée.</w:t>
+      </w:r>
+    </w:p>
+    <w:p>
+      <w:pPr>
+        <w:pStyle w:val="BITTextkrper"/>
+        <w:rPr>
+          <w:lang w:val="fr-CH"/>
+        </w:rPr>
+      </w:pPr>
+      <w:r>
+        <w:rPr>
+          <w:lang w:val="fr-CH"/>
+        </w:rPr>
+        <w:t>Le système doit fournir un retour d’information exploitable en temps réel :</w:t>
+      </w:r>
+    </w:p>
+    <w:p>
+      <w:pPr>
+        <w:pStyle w:val="BITTextkrper"/>
+        <w:numPr>
+          <w:ilvl w:val="0"/>
+          <w:numId w:val="15"/>
+        </w:numPr>
+        <w:rPr>
+          <w:lang w:val="fr-CH"/>
+        </w:rPr>
+      </w:pPr>
+      <w:proofErr w:type="gramStart"/>
+      <w:r>
+        <w:rPr>
+          <w:lang w:val="fr-CH"/>
+        </w:rPr>
+        <w:t>distance</w:t>
+      </w:r>
+      <w:proofErr w:type="gramEnd"/>
+      <w:r>
+        <w:rPr>
+          <w:lang w:val="fr-CH"/>
+        </w:rPr>
+        <w:t xml:space="preserve"> d’obstacle via sonar (remplacement de la vidéo lorsque non disponible) ;</w:t>
+      </w:r>
+    </w:p>
+    <w:p>
+      <w:pPr>
+        <w:pStyle w:val="BITTextkrper"/>
+        <w:numPr>
+          <w:ilvl w:val="0"/>
+          <w:numId w:val="15"/>
+        </w:numPr>
+        <w:rPr>
+          <w:lang w:val="en-US"/>
+        </w:rPr>
+      </w:pPr>
+      <w:proofErr w:type="spellStart"/>
+      <w:r>
+        <w:rPr>
+          <w:lang w:val="en-US"/>
+        </w:rPr>
+        <w:t>température</w:t>
+      </w:r>
+      <w:proofErr w:type="spellEnd"/>
+      <w:r>
+        <w:rPr>
+          <w:lang w:val="en-US"/>
+        </w:rPr>
+        <w:t xml:space="preserve">, </w:t>
+      </w:r>
+      <w:proofErr w:type="spellStart"/>
+      <w:r>
+        <w:rPr>
+          <w:lang w:val="en-US"/>
+        </w:rPr>
+        <w:t>humidité</w:t>
+      </w:r>
+      <w:proofErr w:type="spellEnd"/>
+      <w:r>
+        <w:rPr>
+          <w:lang w:val="en-US"/>
+        </w:rPr>
+        <w:t xml:space="preserve">, </w:t>
+      </w:r>
+      <w:proofErr w:type="spellStart"/>
+      <w:proofErr w:type="gramStart"/>
+      <w:r>
+        <w:rPr>
+          <w:lang w:val="en-US"/>
+        </w:rPr>
+        <w:t>luminosité</w:t>
+      </w:r>
+      <w:proofErr w:type="spellEnd"/>
+      <w:r>
+        <w:rPr>
+          <w:lang w:val="en-US"/>
+        </w:rPr>
+        <w:t xml:space="preserve"> ;</w:t>
+      </w:r>
+      <w:proofErr w:type="gramEnd"/>
+    </w:p>
+    <w:p>
+      <w:pPr>
+        <w:pStyle w:val="BITTextkrper"/>
+        <w:numPr>
+          <w:ilvl w:val="0"/>
+          <w:numId w:val="15"/>
+        </w:numPr>
+        <w:rPr>
+          <w:lang w:val="fr-CH"/>
+        </w:rPr>
+      </w:pPr>
+      <w:proofErr w:type="gramStart"/>
+      <w:r>
+        <w:rPr>
+          <w:lang w:val="fr-CH"/>
+        </w:rPr>
+        <w:t>niveau</w:t>
+      </w:r>
+      <w:proofErr w:type="gramEnd"/>
+      <w:r>
+        <w:rPr>
+          <w:lang w:val="fr-CH"/>
+        </w:rPr>
+        <w:t xml:space="preserve"> de batterie et alertes ;</w:t>
+      </w:r>
+    </w:p>
+    <w:p>
+      <w:pPr>
+        <w:pStyle w:val="BITTextkrper"/>
+        <w:numPr>
+          <w:ilvl w:val="0"/>
+          <w:numId w:val="15"/>
+        </w:numPr>
+        <w:rPr>
+          <w:lang w:val="fr-CH"/>
+        </w:rPr>
+      </w:pPr>
+      <w:proofErr w:type="gramStart"/>
+      <w:r>
+        <w:rPr>
+          <w:lang w:val="fr-CH"/>
+        </w:rPr>
+        <w:t>fil</w:t>
+      </w:r>
+      <w:proofErr w:type="gramEnd"/>
+      <w:r>
+        <w:rPr>
+          <w:lang w:val="fr-CH"/>
+        </w:rPr>
+        <w:t xml:space="preserve"> d’Ariane (position approximative) pour faciliter le retour en arrière et la récupération du robot.</w:t>
+      </w:r>
+    </w:p>
+    <w:p>
+      <w:pPr>
+        <w:pStyle w:val="BITTextkrper"/>
+        <w:rPr>
+          <w:lang w:val="fr-CH"/>
+        </w:rPr>
+      </w:pPr>
+      <w:r>
+        <w:rPr>
+          <w:lang w:val="fr-CH"/>
+        </w:rPr>
+        <w:t xml:space="preserve">Enfin, l’état désiré inclut une traçabilité minimale : enregistrement des mesures et génération automatique d’un rapport de mission. Le système doit rester maintenable (services séparés, </w:t>
+      </w:r>
+      <w:r>
+        <w:rPr>
+          <w:lang w:val="fr-CH"/>
+        </w:rPr>
+        <w:lastRenderedPageBreak/>
+        <w:t>paramètres centralisés, diagnostic possible), afin qu’un autre développeur puisse reprendre le projet sans réapprendre toute la logique matériel/logiciel.</w:t>
+      </w:r>
+    </w:p>
+    <w:p>
+      <w:pPr>
+        <w:pStyle w:val="BITTextkrper"/>
+        <w:rPr>
+          <w:lang w:val="fr-CH"/>
+        </w:rPr>
+      </w:pPr>
     </w:p>
     <w:p>
       <w:pPr>
@@ -7142,35 +7575,7 @@
         <w:rPr>
           <w:lang w:val="fr-CH"/>
         </w:rPr>
-        <w:t xml:space="preserve">)” est important : ici on ouvre un </w:t>
-      </w:r>
-      <w:proofErr w:type="spellStart"/>
-      <w:r>
-        <w:rPr>
-          <w:lang w:val="fr-CH"/>
-        </w:rPr>
-        <w:t>device</w:t>
-      </w:r>
-      <w:proofErr w:type="spellEnd"/>
-      <w:r>
-        <w:rPr>
-          <w:lang w:val="fr-CH"/>
-        </w:rPr>
-        <w:t xml:space="preserve"> moteur rattaché à un hub réseau, pas un “hub port </w:t>
-      </w:r>
-      <w:proofErr w:type="spellStart"/>
-      <w:r>
-        <w:rPr>
-          <w:lang w:val="fr-CH"/>
-        </w:rPr>
-        <w:t>device</w:t>
-      </w:r>
-      <w:proofErr w:type="spellEnd"/>
-      <w:r>
-        <w:rPr>
-          <w:lang w:val="fr-CH"/>
-        </w:rPr>
-        <w:t>”.</w:t>
+        <w:t>)” est important : ici on ouvre un device moteur rattaché à un hub réseau, pas un “hub port device”.</w:t>
       </w:r>
     </w:p>
     <w:p>
@@ -8251,133 +8656,105 @@
         <w:rPr>
           <w:lang w:val="fr-CH"/>
         </w:rPr>
-        <w:t>/</w:t>
+        <w:t xml:space="preserve">/ip/port), puis ouvre un </w:t>
       </w:r>
       <w:proofErr w:type="spellStart"/>
       <w:r>
         <w:rPr>
           <w:lang w:val="fr-CH"/>
         </w:rPr>
-        <w:t>ip</w:t>
+        <w:t>DistanceSensor</w:t>
       </w:r>
       <w:proofErr w:type="spellEnd"/>
       <w:r>
         <w:rPr>
           <w:lang w:val="fr-CH"/>
         </w:rPr>
-        <w:t xml:space="preserve">/port), puis ouvre un </w:t>
+        <w:t xml:space="preserve"> sur un </w:t>
       </w:r>
       <w:proofErr w:type="spellStart"/>
       <w:r>
         <w:rPr>
           <w:lang w:val="fr-CH"/>
         </w:rPr>
-        <w:t>DistanceSensor</w:t>
+        <w:t>hubPort</w:t>
       </w:r>
       <w:proofErr w:type="spellEnd"/>
       <w:r>
         <w:rPr>
           <w:lang w:val="fr-CH"/>
         </w:rPr>
-        <w:t xml:space="preserve"> sur un </w:t>
+        <w:t xml:space="preserve"> et un </w:t>
       </w:r>
       <w:proofErr w:type="spellStart"/>
       <w:r>
         <w:rPr>
           <w:lang w:val="fr-CH"/>
         </w:rPr>
-        <w:t>hubPort</w:t>
+        <w:t>channel</w:t>
       </w:r>
       <w:proofErr w:type="spellEnd"/>
       <w:r>
         <w:rPr>
           <w:lang w:val="fr-CH"/>
         </w:rPr>
-        <w:t xml:space="preserve"> et un </w:t>
+        <w:t xml:space="preserve">. La boucle interne tourne toutes les 250 ms (LOOP_MS = 250) et publie un </w:t>
       </w:r>
       <w:proofErr w:type="spellStart"/>
       <w:r>
         <w:rPr>
           <w:lang w:val="fr-CH"/>
         </w:rPr>
-        <w:t>channel</w:t>
+        <w:t>SonarState</w:t>
       </w:r>
       <w:proofErr w:type="spellEnd"/>
       <w:r>
         <w:rPr>
           <w:lang w:val="fr-CH"/>
         </w:rPr>
-        <w:t xml:space="preserve">. La boucle interne tourne toutes les 250 ms (LOOP_MS = 250) et publie un </w:t>
+        <w:t xml:space="preserve"> à chaque </w:t>
       </w:r>
       <w:proofErr w:type="spellStart"/>
       <w:r>
         <w:rPr>
           <w:lang w:val="fr-CH"/>
         </w:rPr>
-        <w:t>SonarState</w:t>
+        <w:t>tick</w:t>
       </w:r>
       <w:proofErr w:type="spellEnd"/>
       <w:r>
         <w:rPr>
           <w:lang w:val="fr-CH"/>
         </w:rPr>
-        <w:t xml:space="preserve"> à chaque </w:t>
+        <w:t>, même en cas d’erreur.</w:t>
+      </w:r>
+    </w:p>
+    <w:p>
+      <w:pPr>
+        <w:pStyle w:val="BITTextkrper"/>
+        <w:rPr>
+          <w:lang w:val="fr-CH"/>
+        </w:rPr>
+      </w:pPr>
+      <w:r>
+        <w:rPr>
+          <w:lang w:val="fr-CH"/>
+        </w:rPr>
+        <w:t xml:space="preserve">Exemple d’instanciation réelle (dans Main) : même </w:t>
       </w:r>
       <w:proofErr w:type="spellStart"/>
       <w:r>
         <w:rPr>
           <w:lang w:val="fr-CH"/>
         </w:rPr>
-        <w:t>tick</w:t>
+        <w:t>serverName</w:t>
       </w:r>
       <w:proofErr w:type="spellEnd"/>
       <w:r>
         <w:rPr>
           <w:lang w:val="fr-CH"/>
         </w:rPr>
-        <w:t>, même en cas d’erreur.</w:t>
-      </w:r>
-    </w:p>
-    <w:p>
-      <w:pPr>
-        <w:pStyle w:val="BITTextkrper"/>
-        <w:rPr>
-          <w:lang w:val="fr-CH"/>
-        </w:rPr>
-      </w:pPr>
-      <w:r>
-        <w:rPr>
-          <w:lang w:val="fr-CH"/>
-        </w:rPr>
-        <w:t xml:space="preserve">Exemple d’instanciation réelle (dans Main) : même </w:t>
-      </w:r>
-      <w:proofErr w:type="spellStart"/>
-      <w:r>
-        <w:rPr>
-          <w:lang w:val="fr-CH"/>
-        </w:rPr>
-        <w:t>serverName</w:t>
-      </w:r>
-      <w:proofErr w:type="spellEnd"/>
-      <w:r>
-        <w:rPr>
-          <w:lang w:val="fr-CH"/>
-        </w:rPr>
-        <w:t>/</w:t>
-      </w:r>
-      <w:proofErr w:type="spellStart"/>
-      <w:r>
-        <w:rPr>
-          <w:lang w:val="fr-CH"/>
-        </w:rPr>
-        <w:t>ip</w:t>
-      </w:r>
-      <w:proofErr w:type="spellEnd"/>
-      <w:r>
-        <w:rPr>
-          <w:lang w:val="fr-CH"/>
-        </w:rPr>
-        <w:t xml:space="preserve">/port que les moteurs, mais </w:t>
+        <w:t xml:space="preserve">/ip/port que les moteurs, mais </w:t>
       </w:r>
       <w:proofErr w:type="spellStart"/>
       <w:r>
@@ -8582,21 +8959,7 @@
         <w:rPr>
           <w:lang w:val="fr-CH"/>
         </w:rPr>
-        <w:t xml:space="preserve"> les paramètres (server/</w:t>
-      </w:r>
-      <w:proofErr w:type="spellStart"/>
-      <w:r>
-        <w:rPr>
-          <w:lang w:val="fr-CH"/>
-        </w:rPr>
-        <w:t>ip</w:t>
-      </w:r>
-      <w:proofErr w:type="spellEnd"/>
-      <w:r>
-        <w:rPr>
-          <w:lang w:val="fr-CH"/>
-        </w:rPr>
-        <w:t>/port/</w:t>
+        <w:t xml:space="preserve"> les paramètres (server/ip/port/</w:t>
       </w:r>
       <w:proofErr w:type="spellStart"/>
       <w:r>
@@ -9619,21 +9982,7 @@
         <w:rPr>
           <w:lang w:val="fr-CH"/>
         </w:rPr>
-        <w:t>/</w:t>
-      </w:r>
-      <w:proofErr w:type="spellStart"/>
-      <w:r>
-        <w:rPr>
-          <w:lang w:val="fr-CH"/>
-        </w:rPr>
-        <w:t>ip</w:t>
-      </w:r>
-      <w:proofErr w:type="spellEnd"/>
-      <w:r>
-        <w:rPr>
-          <w:lang w:val="fr-CH"/>
-        </w:rPr>
-        <w:t>/port incohérents entre sonar et moteurs, et l’erreur classique “</w:t>
+        <w:t>/ip/port incohérents entre sonar et moteurs, et l’erreur classique “</w:t>
       </w:r>
       <w:proofErr w:type="spellStart"/>
       <w:r>
@@ -9815,6 +10164,176 @@
     </w:p>
     <w:p>
       <w:pPr>
+        <w:pStyle w:val="NormalWeb"/>
+        <w:rPr>
+          <w:lang w:eastAsia="en-US"/>
+        </w:rPr>
+      </w:pPr>
+      <w:proofErr w:type="gramStart"/>
+      <w:r>
+        <w:rPr>
+          <w:rFonts w:hAnsi="Symbol"/>
+        </w:rPr>
+        <w:t></w:t>
+      </w:r>
+      <w:r>
+        <w:t xml:space="preserve">  </w:t>
+      </w:r>
+      <w:r>
+        <w:rPr>
+          <w:rStyle w:val="lev"/>
+        </w:rPr>
+        <w:t>Localisation</w:t>
+      </w:r>
+      <w:proofErr w:type="gramEnd"/>
+      <w:r>
+        <w:rPr>
+          <w:rStyle w:val="lev"/>
+        </w:rPr>
+        <w:t xml:space="preserve"> / fil d’Ariane</w:t>
+      </w:r>
+      <w:r>
+        <w:t xml:space="preserve"> : améliorer la précision (correction de dérive) avec une meilleure modélisation des déplacements, et/ou ajout d’un capteur d’orientation/odométrie si le matériel le permet.</w:t>
+      </w:r>
+    </w:p>
+    <w:p>
+      <w:pPr>
+        <w:pStyle w:val="NormalWeb"/>
+      </w:pPr>
+      <w:proofErr w:type="gramStart"/>
+      <w:r>
+        <w:rPr>
+          <w:rFonts w:hAnsi="Symbol"/>
+        </w:rPr>
+        <w:t></w:t>
+      </w:r>
+      <w:r>
+        <w:t xml:space="preserve">  </w:t>
+      </w:r>
+      <w:r>
+        <w:rPr>
+          <w:rStyle w:val="lev"/>
+        </w:rPr>
+        <w:t>Sonar</w:t>
+      </w:r>
+      <w:proofErr w:type="gramEnd"/>
+      <w:r>
+        <w:t xml:space="preserve"> : intégrer la logique “obstacle” dans un contrôleur unique (seuil + hystérésis + anti-spam), et unifier la consommation UI/alertes pour éviter les doublons et faciliter les tests.</w:t>
+      </w:r>
+    </w:p>
+    <w:p>
+      <w:pPr>
+        <w:pStyle w:val="NormalWeb"/>
+      </w:pPr>
+      <w:proofErr w:type="gramStart"/>
+      <w:r>
+        <w:rPr>
+          <w:rFonts w:hAnsi="Symbol"/>
+        </w:rPr>
+        <w:t></w:t>
+      </w:r>
+      <w:r>
+        <w:t xml:space="preserve">  </w:t>
+      </w:r>
+      <w:r>
+        <w:rPr>
+          <w:rStyle w:val="lev"/>
+        </w:rPr>
+        <w:t>Robustesse</w:t>
+      </w:r>
+      <w:proofErr w:type="gramEnd"/>
+      <w:r>
+        <w:rPr>
+          <w:rStyle w:val="lev"/>
+        </w:rPr>
+        <w:t xml:space="preserve"> connexion</w:t>
+      </w:r>
+      <w:r>
+        <w:t xml:space="preserve"> : journaliser les erreurs réseau/capteurs (codes, contexte : ip/port/</w:t>
+      </w:r>
+      <w:proofErr w:type="spellStart"/>
+      <w:r>
+        <w:t>hubPort</w:t>
+      </w:r>
+      <w:proofErr w:type="spellEnd"/>
+      <w:r>
+        <w:t>/</w:t>
+      </w:r>
+      <w:proofErr w:type="spellStart"/>
+      <w:r>
+        <w:t>channel</w:t>
+      </w:r>
+      <w:proofErr w:type="spellEnd"/>
+      <w:r>
+        <w:t>), et ajouter un écran “diagnostic” pour accélérer le dépannage terrain.</w:t>
+      </w:r>
+    </w:p>
+    <w:p>
+      <w:pPr>
+        <w:pStyle w:val="NormalWeb"/>
+      </w:pPr>
+      <w:proofErr w:type="gramStart"/>
+      <w:r>
+        <w:rPr>
+          <w:rFonts w:hAnsi="Symbol"/>
+        </w:rPr>
+        <w:t></w:t>
+      </w:r>
+      <w:r>
+        <w:t xml:space="preserve">  </w:t>
+      </w:r>
+      <w:r>
+        <w:rPr>
+          <w:rStyle w:val="lev"/>
+        </w:rPr>
+        <w:t>Rapport</w:t>
+      </w:r>
+      <w:proofErr w:type="gramEnd"/>
+      <w:r>
+        <w:rPr>
+          <w:rStyle w:val="lev"/>
+        </w:rPr>
+        <w:t xml:space="preserve"> de mission</w:t>
+      </w:r>
+      <w:r>
+        <w:t xml:space="preserve"> : enrichir le rapport (timeline, événements : perte de signal, arrêt d’urgence, obstacle proche, niveaux batterie) et exporter en PDF/CSV.</w:t>
+      </w:r>
+    </w:p>
+    <w:p>
+      <w:pPr>
+        <w:pStyle w:val="NormalWeb"/>
+      </w:pPr>
+      <w:proofErr w:type="gramStart"/>
+      <w:r>
+        <w:rPr>
+          <w:rFonts w:hAnsi="Symbol"/>
+        </w:rPr>
+        <w:t></w:t>
+      </w:r>
+      <w:r>
+        <w:t xml:space="preserve">  </w:t>
+      </w:r>
+      <w:r>
+        <w:rPr>
+          <w:rStyle w:val="lev"/>
+        </w:rPr>
+        <w:t>Tests</w:t>
+      </w:r>
+      <w:proofErr w:type="gramEnd"/>
+      <w:r>
+        <w:t xml:space="preserve"> : compléter le protocole de tests avec des cas concrets (perte de signal, obstacle oscillant autour du seuil, capteur débranché, reconnexion hub), critères de réussite mesurables, et résultats observés.</w:t>
+      </w:r>
+    </w:p>
+    <w:p>
+      <w:pPr>
+        <w:pStyle w:val="BITTextkrper"/>
+        <w:rPr>
+          <w:lang w:val="fr-CH"/>
+        </w:rPr>
+      </w:pPr>
+    </w:p>
+    <w:p>
+      <w:pPr>
         <w:pStyle w:val="Titre2"/>
       </w:pPr>
       <w:bookmarkStart w:id="49" w:name="_Toc219185386"/>
@@ -9825,236 +10344,303 @@
     </w:p>
     <w:p>
       <w:pPr>
+        <w:pStyle w:val="NormalWeb"/>
+        <w:rPr>
+          <w:rFonts w:ascii="Arial" w:hAnsi="Arial" w:cs="Arial"/>
+          <w:lang w:eastAsia="en-US"/>
+        </w:rPr>
+      </w:pPr>
+      <w:r>
+        <w:rPr>
+          <w:rFonts w:ascii="Arial" w:hAnsi="Arial" w:cs="Arial"/>
+        </w:rPr>
+        <w:t>Sur le plan fonctionnel, nous avons atteint l’objectif principal : un pilotage opérationnel et une lecture capteurs exploitable, avec des mécanismes de sécurité (arrêt d’urgence, arrêt sur perte de connexion) et une compensation crédible à l’absence de vidéo grâce au sonar et au fil d’Ariane. La solution est utilisable et démontre une logique orientée terrain : diagnostic possible, comportement prévisible, et retour utilisateur en temps réel.</w:t>
+      </w:r>
+    </w:p>
+    <w:p>
+      <w:pPr>
+        <w:pStyle w:val="NormalWeb"/>
+        <w:rPr>
+          <w:rFonts w:ascii="Arial" w:hAnsi="Arial" w:cs="Arial"/>
+        </w:rPr>
+      </w:pPr>
+      <w:r>
+        <w:rPr>
+          <w:rFonts w:ascii="Arial" w:hAnsi="Arial" w:cs="Arial"/>
+        </w:rPr>
+        <w:t>Sur le plan technique, nous avons correctement séparé les responsabilités (services matériel, états publiés, consommation UI/logique), ce qui a permis d’itérer malgré les contraintes matérielles. En revanche, la documentation n’a pas suivi le niveau attendu : sections incomplètes et UML incohérent par rapport au code. C’est un point faible clair : on a privilégié l’exécution et la stabilisation au détriment de la formalisation.</w:t>
+      </w:r>
+    </w:p>
+    <w:p>
+      <w:pPr>
+        <w:pStyle w:val="NormalWeb"/>
+        <w:rPr>
+          <w:rFonts w:ascii="Arial" w:hAnsi="Arial" w:cs="Arial"/>
+        </w:rPr>
+      </w:pPr>
+      <w:r>
+        <w:rPr>
+          <w:rFonts w:ascii="Arial" w:hAnsi="Arial" w:cs="Arial"/>
+        </w:rPr>
+        <w:t>Si c’était à refaire, nous imposerions un “minimum documentaire” par sprint (mise à jour UML + protocole de tests + synthèse des changements matériels) pour éviter le rattrapage final. Le projet reste formateur : il nous a forcés à gérer l’incertitude matérielle, prioriser la sécurité, et livrer une solution fonctionnelle malgré des changements d’exigences.</w:t>
+      </w:r>
+    </w:p>
+    <w:p>
+      <w:pPr>
+        <w:pStyle w:val="BITTextkrper"/>
+        <w:rPr>
+          <w:lang w:val="fr-CH"/>
+        </w:rPr>
+      </w:pPr>
+    </w:p>
+    <w:p>
+      <w:pPr>
         <w:pStyle w:val="Titre2"/>
       </w:pPr>
       <w:bookmarkStart w:id="50" w:name="_Toc219185387"/>
-      <w:r>
-        <w:t xml:space="preserve">Conclusion du module de </w:t>
-      </w:r>
-      <w:r>
-        <w:t xml:space="preserve">Maxime </w:t>
-      </w:r>
-      <w:proofErr w:type="spellStart"/>
-      <w:r>
-        <w:t>Bardy</w:t>
-      </w:r>
-      <w:bookmarkEnd w:id="50"/>
-      <w:proofErr w:type="spellEnd"/>
-    </w:p>
-    <w:p>
-      <w:pPr>
-        <w:pStyle w:val="BITTextkrper"/>
-        <w:rPr>
-          <w:lang w:val="fr-CH"/>
-        </w:rPr>
-      </w:pPr>
-      <w:r>
-        <w:rPr>
-          <w:lang w:val="fr-CH"/>
-        </w:rPr>
-        <w:t>Ce module m’a permis de travailler sur un projet concret avec des contraintes réelles, notamment au niveau du matériel et de ce qu’il était possible d’implémenter dans le temps donné. Au début, il y avait quelques incertitudes sur la faisabilité de certaines fonctions, ce qui a demandé de rester flexible et de prendre des décisions rapidement quand une solution ne pouvait pas être mise en place comme prévu.</w:t>
-      </w:r>
-    </w:p>
-    <w:p>
-      <w:pPr>
-        <w:pStyle w:val="BITTextkrper"/>
-        <w:rPr>
-          <w:lang w:val="fr-CH"/>
-        </w:rPr>
-      </w:pPr>
-      <w:r>
-        <w:rPr>
-          <w:lang w:val="fr-CH"/>
-        </w:rPr>
-        <w:t>Plusieurs éléments ont dû être adaptés en cours de route, par exemple le remplacement de la caméra par un sonar, l’utilisation d’un capteur de luminosité à la place d’un éclairage, ainsi que l’abandon du mode crabe. Ces changements ont surtout demandé de bien analyser les limites techniques et de garder comme priorité une solution stable et exploitable.</w:t>
-      </w:r>
-    </w:p>
-    <w:p>
-      <w:pPr>
-        <w:pStyle w:val="BITTextkrper"/>
-        <w:rPr>
-          <w:lang w:val="fr-CH"/>
-        </w:rPr>
-      </w:pPr>
-      <w:r>
-        <w:rPr>
-          <w:lang w:val="fr-CH"/>
-        </w:rPr>
-        <w:t>J’ai aussi constaté une vraie progression dans ma manière de travailler après environ deux à trois semaines : l’organisation était plus efficace, les objectifs plus clairs, et la qualité du travail a augmenté. Cette évolution m’a aidé à être plus structuré, à mieux planifier, et à mieux gérer les imprévus.</w:t>
-      </w:r>
-    </w:p>
-    <w:p>
-      <w:pPr>
-        <w:pStyle w:val="BITTextkrper"/>
-        <w:rPr>
-          <w:lang w:val="fr-CH"/>
-        </w:rPr>
-      </w:pPr>
-      <w:r>
-        <w:rPr>
-          <w:lang w:val="fr-CH"/>
-        </w:rPr>
-        <w:t>Pour conclure, je suis satisfait du résultat obtenu, car le système final répond aux besoins essentiels et démontre qu’il est possible de livrer une solution fiable malgré des contraintes et des ajustements en cours de projet. Ce module m’a permis d’améliorer mes compétences techniques et ma rigueur, et m’a donné une bonne expérience de travail sur un projet complet.</w:t>
-      </w:r>
-    </w:p>
-    <w:p>
-      <w:pPr>
-        <w:pStyle w:val="Titre2"/>
-      </w:pPr>
-      <w:bookmarkStart w:id="51" w:name="_Toc219185388"/>
-      <w:r>
-        <w:t>Conclusion du module de</w:t>
-      </w:r>
-      <w:r>
-        <w:t xml:space="preserve"> Cyril Hohl</w:t>
-      </w:r>
-      <w:bookmarkEnd w:id="51"/>
-    </w:p>
-    <w:p>
-      <w:pPr>
-        <w:rPr>
-          <w:lang w:val="fr-CH"/>
-        </w:rPr>
-      </w:pPr>
-      <w:r>
-        <w:rPr>
-          <w:lang w:val="fr-CH"/>
-        </w:rPr>
-        <w:t xml:space="preserve">Ce projet de </w:t>
-      </w:r>
-      <w:r>
-        <w:rPr>
-          <w:lang w:val="fr-CH"/>
-        </w:rPr>
-        <w:t>groupe</w:t>
-      </w:r>
-      <w:r>
-        <w:rPr>
-          <w:lang w:val="fr-CH"/>
-        </w:rPr>
-        <w:t xml:space="preserve"> a été une expérience formatrice, mais dont le démarrage a été difficile pour moi. Au début, j’ai eu de la peine à bien entrer dans le projet et à comprendre l’ensemble de l’organisation générale.</w:t>
-      </w:r>
-    </w:p>
-    <w:p>
-      <w:pPr>
-        <w:rPr>
-          <w:lang w:val="fr-CH"/>
-        </w:rPr>
-      </w:pPr>
-      <w:r>
-        <w:rPr>
-          <w:lang w:val="fr-CH"/>
-        </w:rPr>
-        <w:t>À partir d</w:t>
-      </w:r>
-      <w:r>
-        <w:rPr>
-          <w:lang w:val="fr-CH"/>
-        </w:rPr>
-        <w:t>u milieu de la</w:t>
-      </w:r>
-      <w:r>
-        <w:rPr>
-          <w:lang w:val="fr-CH"/>
-        </w:rPr>
-        <w:t xml:space="preserve"> deuxième </w:t>
-      </w:r>
-      <w:r>
-        <w:rPr>
-          <w:lang w:val="fr-CH"/>
-        </w:rPr>
-        <w:t>semaine, une fois le projet réellement lancé, les choses sont devenues plus claires et j’ai pu travailler de manière plus efficace et plus sereine.</w:t>
-      </w:r>
-    </w:p>
-    <w:p>
-      <w:pPr>
-        <w:rPr>
-          <w:lang w:val="fr-CH"/>
-        </w:rPr>
-      </w:pPr>
-      <w:r>
-        <w:rPr>
-          <w:lang w:val="fr-CH"/>
-        </w:rPr>
-        <w:t>La méthodologie Scrum n’était pas totalement claire au départ. J’ai dû revoir les rôles, les réunions et le fonctionnement des sprints afin de mieux comprendre cette manière de travailler en équipe. Une fois ces bases assimilées, Scrum s’est avéré utile pour structurer le projet.</w:t>
-      </w:r>
-    </w:p>
-    <w:p>
-      <w:pPr>
-        <w:rPr>
-          <w:lang w:val="fr-CH"/>
-        </w:rPr>
-      </w:pPr>
-      <w:r>
-        <w:rPr>
-          <w:lang w:val="fr-CH"/>
-        </w:rPr>
-        <w:t>Enfin, l’utilisation de GitHub en groupe a représenté un défi supplémentaire</w:t>
-      </w:r>
-      <w:r>
-        <w:rPr>
-          <w:lang w:val="fr-CH"/>
-        </w:rPr>
-        <w:t xml:space="preserve"> pour moi</w:t>
-      </w:r>
-      <w:r>
-        <w:rPr>
-          <w:lang w:val="fr-CH"/>
-        </w:rPr>
-        <w:t>. La gestion du travail collaboratif n’a pas toujours été simple</w:t>
-      </w:r>
-      <w:r>
-        <w:rPr>
-          <w:lang w:val="fr-CH"/>
-        </w:rPr>
-        <w:t>.</w:t>
-      </w:r>
-    </w:p>
-    <w:p>
-      <w:pPr>
-        <w:rPr>
-          <w:lang w:val="fr-CH"/>
-        </w:rPr>
-      </w:pPr>
-      <w:r>
-        <w:rPr>
-          <w:lang w:val="fr-CH"/>
-        </w:rPr>
-        <w:t>Je suis cependant content du résultat de notre projet</w:t>
-      </w:r>
-      <w:r>
-        <w:rPr>
-          <w:lang w:val="fr-CH"/>
-        </w:rPr>
-        <w:t>.</w:t>
-      </w:r>
-    </w:p>
-    <w:p>
-      <w:pPr>
-        <w:pStyle w:val="BITTextkrper"/>
-        <w:rPr>
-          <w:lang w:val="fr-CH"/>
-        </w:rPr>
-      </w:pPr>
-    </w:p>
-    <w:p>
-      <w:pPr>
-        <w:pStyle w:val="Titre2"/>
-      </w:pPr>
-      <w:bookmarkStart w:id="52" w:name="_Toc219185389"/>
       <w:r>
         <w:lastRenderedPageBreak/>
         <w:t xml:space="preserve">Conclusion du module de </w:t>
       </w:r>
       <w:r>
-        <w:t xml:space="preserve">Romain </w:t>
-      </w:r>
-      <w:proofErr w:type="spellStart"/>
-      <w:r>
-        <w:t>Kolly</w:t>
+        <w:t>Maxime Bardy</w:t>
+      </w:r>
+      <w:bookmarkEnd w:id="50"/>
+    </w:p>
+    <w:p>
+      <w:pPr>
+        <w:pStyle w:val="BITTextkrper"/>
+        <w:rPr>
+          <w:lang w:val="fr-CH"/>
+        </w:rPr>
+      </w:pPr>
+      <w:r>
+        <w:rPr>
+          <w:lang w:val="fr-CH"/>
+        </w:rPr>
+        <w:t>Ce module m’a permis de travailler sur un projet concret avec des contraintes réelles, notamment au niveau du matériel et de ce qu’il était possible d’implémenter dans le temps donné. Au début, il y avait quelques incertitudes sur la faisabilité de certaines fonctions, ce qui a demandé de rester flexible et de prendre des décisions rapidement quand une solution ne pouvait pas être mise en place comme prévu.</w:t>
+      </w:r>
+    </w:p>
+    <w:p>
+      <w:pPr>
+        <w:pStyle w:val="BITTextkrper"/>
+        <w:rPr>
+          <w:lang w:val="fr-CH"/>
+        </w:rPr>
+      </w:pPr>
+      <w:r>
+        <w:rPr>
+          <w:lang w:val="fr-CH"/>
+        </w:rPr>
+        <w:t>Plusieurs éléments ont dû être adaptés en cours de route, par exemple le remplacement de la caméra par un sonar, l’utilisation d’un capteur de luminosité à la place d’un éclairage, ainsi que l’abandon du mode crabe. Ces changements ont surtout demandé de bien analyser les limites techniques et de garder comme priorité une solution stable et exploitable.</w:t>
+      </w:r>
+    </w:p>
+    <w:p>
+      <w:pPr>
+        <w:pStyle w:val="BITTextkrper"/>
+        <w:rPr>
+          <w:lang w:val="fr-CH"/>
+        </w:rPr>
+      </w:pPr>
+      <w:r>
+        <w:rPr>
+          <w:lang w:val="fr-CH"/>
+        </w:rPr>
+        <w:t>J’ai aussi constaté une vraie progression dans ma manière de travailler après environ deux à trois semaines : l’organisation était plus efficace, les objectifs plus clairs, et la qualité du travail a augmenté. Cette évolution m’a aidé à être plus structuré, à mieux planifier, et à mieux gérer les imprévus.</w:t>
+      </w:r>
+    </w:p>
+    <w:p>
+      <w:pPr>
+        <w:pStyle w:val="BITTextkrper"/>
+        <w:rPr>
+          <w:lang w:val="fr-CH"/>
+        </w:rPr>
+      </w:pPr>
+      <w:r>
+        <w:rPr>
+          <w:lang w:val="fr-CH"/>
+        </w:rPr>
+        <w:t>Pour conclure, je suis satisfait du résultat obtenu, car le système final répond aux besoins essentiels et démontre qu’il est possible de livrer une solution fiable malgré des contraintes et des ajustements en cours de projet. Ce module m’a permis d’améliorer mes compétences techniques et ma rigueur, et m’a donné une bonne expérience de travail sur un projet complet.</w:t>
+      </w:r>
+    </w:p>
+    <w:p>
+      <w:pPr>
+        <w:pStyle w:val="Titre2"/>
+      </w:pPr>
+      <w:bookmarkStart w:id="51" w:name="_Toc219185388"/>
+      <w:r>
+        <w:t>Conclusion du module de</w:t>
+      </w:r>
+      <w:r>
+        <w:t xml:space="preserve"> Cyril Hohl</w:t>
+      </w:r>
+      <w:bookmarkEnd w:id="51"/>
+    </w:p>
+    <w:p>
+      <w:pPr>
+        <w:rPr>
+          <w:lang w:val="fr-CH"/>
+        </w:rPr>
+      </w:pPr>
+      <w:r>
+        <w:rPr>
+          <w:lang w:val="fr-CH"/>
+        </w:rPr>
+        <w:t>Ce projet de groupe a été une expérience formatrice, mais dont le démarrage a été difficile pour moi. Au début, j’ai eu de la peine à bien entrer dans le projet et à comprendre l’ensemble de l’organisation générale.</w:t>
+      </w:r>
+    </w:p>
+    <w:p>
+      <w:pPr>
+        <w:rPr>
+          <w:lang w:val="fr-CH"/>
+        </w:rPr>
+      </w:pPr>
+      <w:r>
+        <w:rPr>
+          <w:lang w:val="fr-CH"/>
+        </w:rPr>
+        <w:t>À partir d</w:t>
+      </w:r>
+      <w:r>
+        <w:rPr>
+          <w:lang w:val="fr-CH"/>
+        </w:rPr>
+        <w:t>u milieu de la</w:t>
+      </w:r>
+      <w:r>
+        <w:rPr>
+          <w:lang w:val="fr-CH"/>
+        </w:rPr>
+        <w:t xml:space="preserve"> deuxième </w:t>
+      </w:r>
+      <w:r>
+        <w:rPr>
+          <w:lang w:val="fr-CH"/>
+        </w:rPr>
+        <w:t>semaine, une fois le projet réellement lancé, les choses sont devenues plus claires et j’ai pu travailler de manière plus efficace et plus sereine.</w:t>
+      </w:r>
+    </w:p>
+    <w:p>
+      <w:pPr>
+        <w:rPr>
+          <w:lang w:val="fr-CH"/>
+        </w:rPr>
+      </w:pPr>
+      <w:r>
+        <w:rPr>
+          <w:lang w:val="fr-CH"/>
+        </w:rPr>
+        <w:t>La méthodologie Scrum n’était pas totalement claire au départ. J’ai dû revoir les rôles, les réunions et le fonctionnement des sprints afin de mieux comprendre cette manière de travailler en équipe. Une fois ces bases assimilées, Scrum s’est avéré utile pour structurer le projet.</w:t>
+      </w:r>
+    </w:p>
+    <w:p>
+      <w:pPr>
+        <w:rPr>
+          <w:lang w:val="fr-CH"/>
+        </w:rPr>
+      </w:pPr>
+      <w:r>
+        <w:rPr>
+          <w:lang w:val="fr-CH"/>
+        </w:rPr>
+        <w:t>Enfin, l’utilisation de GitHub en groupe a représenté un défi supplémentaire</w:t>
+      </w:r>
+      <w:r>
+        <w:rPr>
+          <w:lang w:val="fr-CH"/>
+        </w:rPr>
+        <w:t xml:space="preserve"> pour moi</w:t>
+      </w:r>
+      <w:r>
+        <w:rPr>
+          <w:lang w:val="fr-CH"/>
+        </w:rPr>
+        <w:t>. La gestion du travail collaboratif n’a pas toujours été simple</w:t>
+      </w:r>
+      <w:r>
+        <w:rPr>
+          <w:lang w:val="fr-CH"/>
+        </w:rPr>
+        <w:t>.</w:t>
+      </w:r>
+    </w:p>
+    <w:p>
+      <w:pPr>
+        <w:rPr>
+          <w:lang w:val="fr-CH"/>
+        </w:rPr>
+      </w:pPr>
+      <w:r>
+        <w:rPr>
+          <w:lang w:val="fr-CH"/>
+        </w:rPr>
+        <w:t>Je suis cependant content du résultat de notre projet</w:t>
+      </w:r>
+      <w:r>
+        <w:rPr>
+          <w:lang w:val="fr-CH"/>
+        </w:rPr>
+        <w:t>.</w:t>
+      </w:r>
+    </w:p>
+    <w:p>
+      <w:pPr>
+        <w:pStyle w:val="BITTextkrper"/>
+        <w:rPr>
+          <w:lang w:val="fr-CH"/>
+        </w:rPr>
+      </w:pPr>
+    </w:p>
+    <w:p>
+      <w:pPr>
+        <w:pStyle w:val="Titre2"/>
+      </w:pPr>
+      <w:bookmarkStart w:id="52" w:name="_Toc219185389"/>
+      <w:r>
+        <w:t xml:space="preserve">Conclusion du module de </w:t>
+      </w:r>
+      <w:r>
+        <w:t>Romain Kolly</w:t>
       </w:r>
       <w:bookmarkEnd w:id="52"/>
-      <w:proofErr w:type="spellEnd"/>
+    </w:p>
+    <w:p>
+      <w:pPr>
+        <w:pStyle w:val="NormalWeb"/>
+        <w:rPr>
+          <w:rFonts w:ascii="Arial" w:hAnsi="Arial" w:cs="Arial"/>
+          <w:lang w:eastAsia="en-US"/>
+        </w:rPr>
+      </w:pPr>
+      <w:r>
+        <w:rPr>
+          <w:rFonts w:ascii="Arial" w:hAnsi="Arial" w:cs="Arial"/>
+        </w:rPr>
+        <w:t>Ce module m’a permis de travailler sur un projet concret avec des contraintes matérielles réelles et des limites d’implémentation dans le temps imparti. Plusieurs adaptations ont été nécessaires (caméra remplacée par un sonar, capteur de luminosité à la place de l’éclairage, abandon du mode crabe), ce qui m’a appris à prioriser une solution stable et exploitable.</w:t>
+      </w:r>
+    </w:p>
+    <w:p>
+      <w:pPr>
+        <w:pStyle w:val="NormalWeb"/>
+        <w:rPr>
+          <w:rFonts w:ascii="Arial" w:hAnsi="Arial" w:cs="Arial"/>
+        </w:rPr>
+      </w:pPr>
+      <w:r>
+        <w:rPr>
+          <w:rFonts w:ascii="Arial" w:hAnsi="Arial" w:cs="Arial"/>
+        </w:rPr>
+        <w:lastRenderedPageBreak/>
+        <w:t>J’ai aussi progressé dans mon organisation et mon travail d’équipe (meilleure planification, objectifs plus clairs, usage plus rigoureux de GitHub). Je suis satisfait du résultat final, car il répond aux besoins essentiels et démontre qu’on peut livrer quelque chose de fiable malgré les imprévus.</w:t>
+      </w:r>
+    </w:p>
+    <w:p>
+      <w:pPr>
+        <w:pStyle w:val="BITTextkrper"/>
+        <w:rPr>
+          <w:lang w:val="fr-CH"/>
+        </w:rPr>
+      </w:pPr>
     </w:p>
     <w:p>
       <w:pPr>
@@ -10215,6 +10801,7 @@
         <w:rPr>
           <w:lang w:val="fr-CH"/>
         </w:rPr>
+        <w:lastRenderedPageBreak/>
         <w:t>Par exemple j'avais cru à cause d'anciens modules qu'on devait noter les résumés des réunions, alors que ce n'est pas le cas.</w:t>
       </w:r>
     </w:p>
@@ -10500,25 +11087,7 @@
           <w:lang w:val="fr-CH"/>
         </w:rPr>
         <w:br/>
-        <w:t>Assistance à la rédaction, à la structuration et à la compréhension du projet (</w:t>
-      </w:r>
-      <w:proofErr w:type="spellStart"/>
-      <w:r>
-        <w:rPr>
-          <w:sz w:val="22"/>
-          <w:szCs w:val="22"/>
-          <w:lang w:val="fr-CH"/>
-        </w:rPr>
-        <w:t>ChatGPT</w:t>
-      </w:r>
-      <w:proofErr w:type="spellEnd"/>
-      <w:r>
-        <w:rPr>
-          <w:sz w:val="22"/>
-          <w:szCs w:val="22"/>
-          <w:lang w:val="fr-CH"/>
-        </w:rPr>
-        <w:t>).</w:t>
+        <w:t>Assistance à la rédaction, à la structuration et à la compréhension du projet (ChatGPT).</w:t>
       </w:r>
       <w:r>
         <w:rPr>
@@ -10661,7 +11230,6 @@
                 <w:dataBinding w:prefixMappings="xmlns:ns0='http://purl.org/dc/elements/1.1/' xmlns:ns1='http://schemas.openxmlformats.org/package/2006/metadata/core-properties' " w:xpath="/ns1:coreProperties[1]/ns0:creator[1]" w:storeItemID="{6C3C8BC8-F283-45AE-878A-BAB7291924A1}"/>
                 <w:text/>
               </w:sdtPr>
-              <w:sdtEndPr/>
               <w:sdtContent>
                 <w:tc>
                   <w:tcPr>
@@ -10787,7 +11355,7 @@
                   <w:rPr>
                     <w:lang w:val="fr-CH"/>
                   </w:rPr>
-                  <w:t>13.01.2026 09:00</w:t>
+                  <w:t>13.01.2026 11:28</w:t>
                 </w:r>
                 <w:r>
                   <w:rPr>
@@ -10965,7 +11533,6 @@
                 <w:dataBinding w:prefixMappings="xmlns:ns0='http://purl.org/dc/elements/1.1/' xmlns:ns1='http://schemas.openxmlformats.org/package/2006/metadata/core-properties' " w:xpath="/ns1:coreProperties[1]/ns0:creator[1]" w:storeItemID="{6C3C8BC8-F283-45AE-878A-BAB7291924A1}"/>
                 <w:text/>
               </w:sdtPr>
-              <w:sdtEndPr/>
               <w:sdtContent>
                 <w:tc>
                   <w:tcPr>
@@ -11085,7 +11652,7 @@
                   <w:rPr>
                     <w:lang w:val="fr-CH"/>
                   </w:rPr>
-                  <w:t>13.01.2026 09:00</w:t>
+                  <w:t>13.01.2026 11:28</w:t>
                 </w:r>
                 <w:r>
                   <w:rPr>
@@ -11179,7 +11746,6 @@
                 <w:dataBinding w:prefixMappings="xmlns:ns0='http://purl.org/dc/elements/1.1/' xmlns:ns1='http://schemas.openxmlformats.org/package/2006/metadata/core-properties' " w:xpath="/ns1:coreProperties[1]/ns0:creator[1]" w:storeItemID="{6C3C8BC8-F283-45AE-878A-BAB7291924A1}"/>
                 <w:text/>
               </w:sdtPr>
-              <w:sdtEndPr/>
               <w:sdtContent>
                 <w:tc>
                   <w:tcPr>
@@ -11299,7 +11865,7 @@
                   <w:rPr>
                     <w:lang w:val="fr-CH"/>
                   </w:rPr>
-                  <w:t>13.01.2026 09:00</w:t>
+                  <w:t>13.01.2026 11:28</w:t>
                 </w:r>
                 <w:r>
                   <w:rPr>
@@ -11828,6 +12394,155 @@
     </w:lvl>
   </w:abstractNum>
   <w:abstractNum w:abstractNumId="2" w15:restartNumberingAfterBreak="0">
+    <w:nsid w:val="1ADF2000"/>
+    <w:multiLevelType w:val="multilevel"/>
+    <w:tmpl w:val="D4DA5AB0"/>
+    <w:lvl w:ilvl="0">
+      <w:start w:val="1"/>
+      <w:numFmt w:val="bullet"/>
+      <w:lvlText w:val=""/>
+      <w:lvlJc w:val="left"/>
+      <w:pPr>
+        <w:tabs>
+          <w:tab w:val="num" w:pos="720"/>
+        </w:tabs>
+        <w:ind w:left="720" w:hanging="360"/>
+      </w:pPr>
+      <w:rPr>
+        <w:rFonts w:ascii="Symbol" w:hAnsi="Symbol" w:hint="default"/>
+        <w:sz w:val="20"/>
+      </w:rPr>
+    </w:lvl>
+    <w:lvl w:ilvl="1" w:tentative="1">
+      <w:start w:val="1"/>
+      <w:numFmt w:val="bullet"/>
+      <w:lvlText w:val="o"/>
+      <w:lvlJc w:val="left"/>
+      <w:pPr>
+        <w:tabs>
+          <w:tab w:val="num" w:pos="1440"/>
+        </w:tabs>
+        <w:ind w:left="1440" w:hanging="360"/>
+      </w:pPr>
+      <w:rPr>
+        <w:rFonts w:ascii="Courier New" w:hAnsi="Courier New" w:hint="default"/>
+        <w:sz w:val="20"/>
+      </w:rPr>
+    </w:lvl>
+    <w:lvl w:ilvl="2" w:tentative="1">
+      <w:start w:val="1"/>
+      <w:numFmt w:val="bullet"/>
+      <w:lvlText w:val=""/>
+      <w:lvlJc w:val="left"/>
+      <w:pPr>
+        <w:tabs>
+          <w:tab w:val="num" w:pos="2160"/>
+        </w:tabs>
+        <w:ind w:left="2160" w:hanging="360"/>
+      </w:pPr>
+      <w:rPr>
+        <w:rFonts w:ascii="Wingdings" w:hAnsi="Wingdings" w:hint="default"/>
+        <w:sz w:val="20"/>
+      </w:rPr>
+    </w:lvl>
+    <w:lvl w:ilvl="3" w:tentative="1">
+      <w:start w:val="1"/>
+      <w:numFmt w:val="bullet"/>
+      <w:lvlText w:val=""/>
+      <w:lvlJc w:val="left"/>
+      <w:pPr>
+        <w:tabs>
+          <w:tab w:val="num" w:pos="2880"/>
+        </w:tabs>
+        <w:ind w:left="2880" w:hanging="360"/>
+      </w:pPr>
+      <w:rPr>
+        <w:rFonts w:ascii="Wingdings" w:hAnsi="Wingdings" w:hint="default"/>
+        <w:sz w:val="20"/>
+      </w:rPr>
+    </w:lvl>
+    <w:lvl w:ilvl="4" w:tentative="1">
+      <w:start w:val="1"/>
+      <w:numFmt w:val="bullet"/>
+      <w:lvlText w:val=""/>
+      <w:lvlJc w:val="left"/>
+      <w:pPr>
+        <w:tabs>
+          <w:tab w:val="num" w:pos="3600"/>
+        </w:tabs>
+        <w:ind w:left="3600" w:hanging="360"/>
+      </w:pPr>
+      <w:rPr>
+        <w:rFonts w:ascii="Wingdings" w:hAnsi="Wingdings" w:hint="default"/>
+        <w:sz w:val="20"/>
+      </w:rPr>
+    </w:lvl>
+    <w:lvl w:ilvl="5" w:tentative="1">
+      <w:start w:val="1"/>
+      <w:numFmt w:val="bullet"/>
+      <w:lvlText w:val=""/>
+      <w:lvlJc w:val="left"/>
+      <w:pPr>
+        <w:tabs>
+          <w:tab w:val="num" w:pos="4320"/>
+        </w:tabs>
+        <w:ind w:left="4320" w:hanging="360"/>
+      </w:pPr>
+      <w:rPr>
+        <w:rFonts w:ascii="Wingdings" w:hAnsi="Wingdings" w:hint="default"/>
+        <w:sz w:val="20"/>
+      </w:rPr>
+    </w:lvl>
+    <w:lvl w:ilvl="6" w:tentative="1">
+      <w:start w:val="1"/>
+      <w:numFmt w:val="bullet"/>
+      <w:lvlText w:val=""/>
+      <w:lvlJc w:val="left"/>
+      <w:pPr>
+        <w:tabs>
+          <w:tab w:val="num" w:pos="5040"/>
+        </w:tabs>
+        <w:ind w:left="5040" w:hanging="360"/>
+      </w:pPr>
+      <w:rPr>
+        <w:rFonts w:ascii="Wingdings" w:hAnsi="Wingdings" w:hint="default"/>
+        <w:sz w:val="20"/>
+      </w:rPr>
+    </w:lvl>
+    <w:lvl w:ilvl="7" w:tentative="1">
+      <w:start w:val="1"/>
+      <w:numFmt w:val="bullet"/>
+      <w:lvlText w:val=""/>
+      <w:lvlJc w:val="left"/>
+      <w:pPr>
+        <w:tabs>
+          <w:tab w:val="num" w:pos="5760"/>
+        </w:tabs>
+        <w:ind w:left="5760" w:hanging="360"/>
+      </w:pPr>
+      <w:rPr>
+        <w:rFonts w:ascii="Wingdings" w:hAnsi="Wingdings" w:hint="default"/>
+        <w:sz w:val="20"/>
+      </w:rPr>
+    </w:lvl>
+    <w:lvl w:ilvl="8" w:tentative="1">
+      <w:start w:val="1"/>
+      <w:numFmt w:val="bullet"/>
+      <w:lvlText w:val=""/>
+      <w:lvlJc w:val="left"/>
+      <w:pPr>
+        <w:tabs>
+          <w:tab w:val="num" w:pos="6480"/>
+        </w:tabs>
+        <w:ind w:left="6480" w:hanging="360"/>
+      </w:pPr>
+      <w:rPr>
+        <w:rFonts w:ascii="Wingdings" w:hAnsi="Wingdings" w:hint="default"/>
+        <w:sz w:val="20"/>
+      </w:rPr>
+    </w:lvl>
+  </w:abstractNum>
+  <w:abstractNum w:abstractNumId="3" w15:restartNumberingAfterBreak="0">
     <w:nsid w:val="1B76422D"/>
     <w:multiLevelType w:val="multilevel"/>
     <w:tmpl w:val="EA926034"/>
@@ -11968,7 +12683,156 @@
       </w:rPr>
     </w:lvl>
   </w:abstractNum>
-  <w:abstractNum w:abstractNumId="3" w15:restartNumberingAfterBreak="0">
+  <w:abstractNum w:abstractNumId="4" w15:restartNumberingAfterBreak="0">
+    <w:nsid w:val="28481988"/>
+    <w:multiLevelType w:val="multilevel"/>
+    <w:tmpl w:val="6FA8E76C"/>
+    <w:lvl w:ilvl="0">
+      <w:start w:val="1"/>
+      <w:numFmt w:val="bullet"/>
+      <w:lvlText w:val=""/>
+      <w:lvlJc w:val="left"/>
+      <w:pPr>
+        <w:tabs>
+          <w:tab w:val="num" w:pos="720"/>
+        </w:tabs>
+        <w:ind w:left="720" w:hanging="360"/>
+      </w:pPr>
+      <w:rPr>
+        <w:rFonts w:ascii="Symbol" w:hAnsi="Symbol" w:hint="default"/>
+        <w:sz w:val="20"/>
+      </w:rPr>
+    </w:lvl>
+    <w:lvl w:ilvl="1" w:tentative="1">
+      <w:start w:val="1"/>
+      <w:numFmt w:val="bullet"/>
+      <w:lvlText w:val="o"/>
+      <w:lvlJc w:val="left"/>
+      <w:pPr>
+        <w:tabs>
+          <w:tab w:val="num" w:pos="1440"/>
+        </w:tabs>
+        <w:ind w:left="1440" w:hanging="360"/>
+      </w:pPr>
+      <w:rPr>
+        <w:rFonts w:ascii="Courier New" w:hAnsi="Courier New" w:hint="default"/>
+        <w:sz w:val="20"/>
+      </w:rPr>
+    </w:lvl>
+    <w:lvl w:ilvl="2" w:tentative="1">
+      <w:start w:val="1"/>
+      <w:numFmt w:val="bullet"/>
+      <w:lvlText w:val=""/>
+      <w:lvlJc w:val="left"/>
+      <w:pPr>
+        <w:tabs>
+          <w:tab w:val="num" w:pos="2160"/>
+        </w:tabs>
+        <w:ind w:left="2160" w:hanging="360"/>
+      </w:pPr>
+      <w:rPr>
+        <w:rFonts w:ascii="Wingdings" w:hAnsi="Wingdings" w:hint="default"/>
+        <w:sz w:val="20"/>
+      </w:rPr>
+    </w:lvl>
+    <w:lvl w:ilvl="3" w:tentative="1">
+      <w:start w:val="1"/>
+      <w:numFmt w:val="bullet"/>
+      <w:lvlText w:val=""/>
+      <w:lvlJc w:val="left"/>
+      <w:pPr>
+        <w:tabs>
+          <w:tab w:val="num" w:pos="2880"/>
+        </w:tabs>
+        <w:ind w:left="2880" w:hanging="360"/>
+      </w:pPr>
+      <w:rPr>
+        <w:rFonts w:ascii="Wingdings" w:hAnsi="Wingdings" w:hint="default"/>
+        <w:sz w:val="20"/>
+      </w:rPr>
+    </w:lvl>
+    <w:lvl w:ilvl="4" w:tentative="1">
+      <w:start w:val="1"/>
+      <w:numFmt w:val="bullet"/>
+      <w:lvlText w:val=""/>
+      <w:lvlJc w:val="left"/>
+      <w:pPr>
+        <w:tabs>
+          <w:tab w:val="num" w:pos="3600"/>
+        </w:tabs>
+        <w:ind w:left="3600" w:hanging="360"/>
+      </w:pPr>
+      <w:rPr>
+        <w:rFonts w:ascii="Wingdings" w:hAnsi="Wingdings" w:hint="default"/>
+        <w:sz w:val="20"/>
+      </w:rPr>
+    </w:lvl>
+    <w:lvl w:ilvl="5" w:tentative="1">
+      <w:start w:val="1"/>
+      <w:numFmt w:val="bullet"/>
+      <w:lvlText w:val=""/>
+      <w:lvlJc w:val="left"/>
+      <w:pPr>
+        <w:tabs>
+          <w:tab w:val="num" w:pos="4320"/>
+        </w:tabs>
+        <w:ind w:left="4320" w:hanging="360"/>
+      </w:pPr>
+      <w:rPr>
+        <w:rFonts w:ascii="Wingdings" w:hAnsi="Wingdings" w:hint="default"/>
+        <w:sz w:val="20"/>
+      </w:rPr>
+    </w:lvl>
+    <w:lvl w:ilvl="6" w:tentative="1">
+      <w:start w:val="1"/>
+      <w:numFmt w:val="bullet"/>
+      <w:lvlText w:val=""/>
+      <w:lvlJc w:val="left"/>
+      <w:pPr>
+        <w:tabs>
+          <w:tab w:val="num" w:pos="5040"/>
+        </w:tabs>
+        <w:ind w:left="5040" w:hanging="360"/>
+      </w:pPr>
+      <w:rPr>
+        <w:rFonts w:ascii="Wingdings" w:hAnsi="Wingdings" w:hint="default"/>
+        <w:sz w:val="20"/>
+      </w:rPr>
+    </w:lvl>
+    <w:lvl w:ilvl="7" w:tentative="1">
+      <w:start w:val="1"/>
+      <w:numFmt w:val="bullet"/>
+      <w:lvlText w:val=""/>
+      <w:lvlJc w:val="left"/>
+      <w:pPr>
+        <w:tabs>
+          <w:tab w:val="num" w:pos="5760"/>
+        </w:tabs>
+        <w:ind w:left="5760" w:hanging="360"/>
+      </w:pPr>
+      <w:rPr>
+        <w:rFonts w:ascii="Wingdings" w:hAnsi="Wingdings" w:hint="default"/>
+        <w:sz w:val="20"/>
+      </w:rPr>
+    </w:lvl>
+    <w:lvl w:ilvl="8" w:tentative="1">
+      <w:start w:val="1"/>
+      <w:numFmt w:val="bullet"/>
+      <w:lvlText w:val=""/>
+      <w:lvlJc w:val="left"/>
+      <w:pPr>
+        <w:tabs>
+          <w:tab w:val="num" w:pos="6480"/>
+        </w:tabs>
+        <w:ind w:left="6480" w:hanging="360"/>
+      </w:pPr>
+      <w:rPr>
+        <w:rFonts w:ascii="Wingdings" w:hAnsi="Wingdings" w:hint="default"/>
+        <w:sz w:val="20"/>
+      </w:rPr>
+    </w:lvl>
+  </w:abstractNum>
+  <w:abstractNum w:abstractNumId="5" w15:restartNumberingAfterBreak="0">
     <w:nsid w:val="285D3D45"/>
     <w:multiLevelType w:val="hybridMultilevel"/>
     <w:tmpl w:val="3C282394"/>
@@ -12055,7 +12919,7 @@
       </w:pPr>
     </w:lvl>
   </w:abstractNum>
-  <w:abstractNum w:abstractNumId="4" w15:restartNumberingAfterBreak="0">
+  <w:abstractNum w:abstractNumId="6" w15:restartNumberingAfterBreak="0">
     <w:nsid w:val="46A571A1"/>
     <w:multiLevelType w:val="hybridMultilevel"/>
     <w:tmpl w:val="3AFAD95C"/>
@@ -12169,7 +13033,7 @@
       </w:rPr>
     </w:lvl>
   </w:abstractNum>
-  <w:abstractNum w:abstractNumId="5" w15:restartNumberingAfterBreak="0">
+  <w:abstractNum w:abstractNumId="7" w15:restartNumberingAfterBreak="0">
     <w:nsid w:val="5A2750AB"/>
     <w:multiLevelType w:val="hybridMultilevel"/>
     <w:tmpl w:val="C0C27804"/>
@@ -12281,7 +13145,7 @@
       </w:rPr>
     </w:lvl>
   </w:abstractNum>
-  <w:abstractNum w:abstractNumId="6" w15:restartNumberingAfterBreak="0">
+  <w:abstractNum w:abstractNumId="8" w15:restartNumberingAfterBreak="0">
     <w:nsid w:val="5A675D5C"/>
     <w:multiLevelType w:val="multilevel"/>
     <w:tmpl w:val="FAE491F0"/>
@@ -12422,7 +13286,7 @@
       </w:rPr>
     </w:lvl>
   </w:abstractNum>
-  <w:abstractNum w:abstractNumId="7" w15:restartNumberingAfterBreak="0">
+  <w:abstractNum w:abstractNumId="9" w15:restartNumberingAfterBreak="0">
     <w:nsid w:val="5B620C2E"/>
     <w:multiLevelType w:val="hybridMultilevel"/>
     <w:tmpl w:val="6E647EC6"/>
@@ -12563,7 +13427,7 @@
       </w:rPr>
     </w:lvl>
   </w:abstractNum>
-  <w:abstractNum w:abstractNumId="8" w15:restartNumberingAfterBreak="0">
+  <w:abstractNum w:abstractNumId="10" w15:restartNumberingAfterBreak="0">
     <w:nsid w:val="719A7C69"/>
     <w:multiLevelType w:val="multilevel"/>
     <w:tmpl w:val="3C2CC90A"/>
@@ -12711,13 +13575,13 @@
     <w:abstractNumId w:val="1"/>
   </w:num>
   <w:num w:numId="2" w16cid:durableId="616833449">
-    <w:abstractNumId w:val="7"/>
+    <w:abstractNumId w:val="9"/>
   </w:num>
   <w:num w:numId="3" w16cid:durableId="824708453">
     <w:abstractNumId w:val="1"/>
   </w:num>
   <w:num w:numId="4" w16cid:durableId="1520658188">
-    <w:abstractNumId w:val="2"/>
+    <w:abstractNumId w:val="3"/>
   </w:num>
   <w:num w:numId="5" w16cid:durableId="353965673">
     <w:abstractNumId w:val="1"/>
@@ -12753,31 +13617,37 @@
     <w:abstractNumId w:val="0"/>
   </w:num>
   <w:num w:numId="7" w16cid:durableId="177886414">
-    <w:abstractNumId w:val="3"/>
+    <w:abstractNumId w:val="5"/>
   </w:num>
   <w:num w:numId="8" w16cid:durableId="807239650">
-    <w:abstractNumId w:val="4"/>
+    <w:abstractNumId w:val="6"/>
   </w:num>
   <w:num w:numId="9" w16cid:durableId="611791626">
-    <w:abstractNumId w:val="3"/>
+    <w:abstractNumId w:val="5"/>
     <w:lvlOverride w:ilvl="0">
       <w:startOverride w:val="1"/>
     </w:lvlOverride>
   </w:num>
   <w:num w:numId="10" w16cid:durableId="2044791889">
-    <w:abstractNumId w:val="3"/>
+    <w:abstractNumId w:val="5"/>
     <w:lvlOverride w:ilvl="0">
       <w:startOverride w:val="1"/>
     </w:lvlOverride>
   </w:num>
   <w:num w:numId="11" w16cid:durableId="574096972">
-    <w:abstractNumId w:val="5"/>
+    <w:abstractNumId w:val="7"/>
   </w:num>
   <w:num w:numId="12" w16cid:durableId="1739328112">
-    <w:abstractNumId w:val="6"/>
+    <w:abstractNumId w:val="8"/>
   </w:num>
   <w:num w:numId="13" w16cid:durableId="538860017">
-    <w:abstractNumId w:val="8"/>
+    <w:abstractNumId w:val="10"/>
+  </w:num>
+  <w:num w:numId="14" w16cid:durableId="1151866743">
+    <w:abstractNumId w:val="2"/>
+  </w:num>
+  <w:num w:numId="15" w16cid:durableId="1833525486">
+    <w:abstractNumId w:val="4"/>
   </w:num>
   <w:numIdMacAtCleanup w:val="10"/>
 </w:numbering>
@@ -13393,7 +14263,6 @@
   <w:style w:type="character" w:default="1" w:styleId="Policepardfaut">
     <w:name w:val="Default Paragraph Font"/>
     <w:uiPriority w:val="1"/>
-    <w:semiHidden/>
     <w:unhideWhenUsed/>
   </w:style>
   <w:style w:type="table" w:default="1" w:styleId="TableauNormal">
@@ -14665,7 +15534,6 @@
     <w:sig w:usb0="E00006FF" w:usb1="0000FCFF" w:usb2="00000001" w:usb3="00000000" w:csb0="0000019F" w:csb1="00000000"/>
   </w:font>
   <w:font w:name="MS Mincho">
-    <w:altName w:val="ＭＳ 明朝"/>
     <w:panose1 w:val="02020609040205080304"/>
     <w:charset w:val="80"/>
     <w:family w:val="modern"/>
@@ -14688,7 +15556,6 @@
     <w:sig w:usb0="E00006FF" w:usb1="420024FF" w:usb2="02000000" w:usb3="00000000" w:csb0="0000019F" w:csb1="00000000"/>
   </w:font>
   <w:font w:name="Yu Mincho">
-    <w:altName w:val="游明朝"/>
     <w:charset w:val="80"/>
     <w:family w:val="roman"/>
     <w:pitch w:val="variable"/>
@@ -14795,6 +15662,7 @@
     <w:rsid w:val="00D57B77"/>
     <w:rsid w:val="00D63728"/>
     <w:rsid w:val="00DB4EF5"/>
+    <w:rsid w:val="00DB6885"/>
     <w:rsid w:val="00DC4DAC"/>
     <w:rsid w:val="00DD63E6"/>
     <w:rsid w:val="00E15316"/>
@@ -14806,6 +15674,7 @@
     <w:rsid w:val="00F5157F"/>
     <w:rsid w:val="00F8402B"/>
     <w:rsid w:val="00F96DD0"/>
+    <w:rsid w:val="00FD1AB8"/>
     <w:rsid w:val="00FE74CC"/>
     <w:rsid w:val="00FE7EB8"/>
   </w:rsids>
@@ -14824,7 +15693,7 @@
   </m:mathPr>
   <w:themeFontLang w:val="fr-CH" w:eastAsia="ja-JP" w:bidi="ar-SA"/>
   <w:clrSchemeMapping w:bg1="light1" w:t1="dark1" w:bg2="light2" w:t2="dark2" w:accent1="accent1" w:accent2="accent2" w:accent3="accent3" w:accent4="accent4" w:accent5="accent5" w:accent6="accent6" w:hyperlink="hyperlink" w:followedHyperlink="followedHyperlink"/>
-  <w:decimalSymbol w:val="."/>
+  <w:decimalSymbol w:val=","/>
   <w:listSeparator w:val=";"/>
   <w15:chartTrackingRefBased/>
 </w:settings>

</xml_diff>

<commit_message>
Ajout des diagrammes manquants dans la doc
</commit_message>
<xml_diff>
--- a/documentation/3_Documentation_Projet.docx
+++ b/documentation/3_Documentation_Projet.docx
@@ -6540,17 +6540,39 @@
           </wp:anchor>
         </w:drawing>
       </w:r>
-      <w:r>
-        <w:rPr>
-          <w:lang w:val="fr-CH"/>
-        </w:rPr>
-        <w:t>Diagramme d’activités</w:t>
-      </w:r>
-      <w:r>
-        <w:rPr>
-          <w:lang w:val="fr-CH"/>
-        </w:rPr>
-        <w:t> : Afficher la température dans l’IHM</w:t>
+      <w:proofErr w:type="spellStart"/>
+      <w:r>
+        <w:rPr>
+          <w:lang w:val="fr-CH"/>
+        </w:rPr>
+        <w:t>Feature</w:t>
+      </w:r>
+      <w:proofErr w:type="spellEnd"/>
+      <w:r>
+        <w:rPr>
+          <w:lang w:val="fr-CH"/>
+        </w:rPr>
+        <w:t xml:space="preserve"> </w:t>
+      </w:r>
+      <w:proofErr w:type="gramStart"/>
+      <w:r>
+        <w:rPr>
+          <w:lang w:val="fr-CH"/>
+        </w:rPr>
+        <w:t>1</w:t>
+      </w:r>
+      <w:r>
+        <w:rPr>
+          <w:lang w:val="fr-CH"/>
+        </w:rPr>
+        <w:t>:</w:t>
+      </w:r>
+      <w:proofErr w:type="gramEnd"/>
+      <w:r>
+        <w:rPr>
+          <w:lang w:val="fr-CH"/>
+        </w:rPr>
+        <w:t xml:space="preserve"> Afficher la température dans l’IHM</w:t>
       </w:r>
     </w:p>
     <w:p>
@@ -6568,16 +6590,45 @@
           <w:lang w:val="fr-CH"/>
         </w:rPr>
       </w:pPr>
-      <w:r>
-        <w:rPr>
-          <w:lang w:val="fr-CH"/>
-        </w:rPr>
-        <w:t>Diagramme de séquence : faire avancer le robot</w:t>
+      <w:proofErr w:type="spellStart"/>
+      <w:r>
+        <w:rPr>
+          <w:lang w:val="fr-CH"/>
+        </w:rPr>
+        <w:t>Feature</w:t>
+      </w:r>
+      <w:proofErr w:type="spellEnd"/>
+      <w:r>
+        <w:rPr>
+          <w:lang w:val="fr-CH"/>
+        </w:rPr>
+        <w:t xml:space="preserve"> 2</w:t>
+      </w:r>
+      <w:r>
+        <w:rPr>
+          <w:lang w:val="fr-CH"/>
+        </w:rPr>
+        <w:t> : faire avancer le robot</w:t>
       </w:r>
     </w:p>
     <w:p>
       <w:pPr>
         <w:pStyle w:val="BITTextkrper"/>
+        <w:rPr>
+          <w:lang w:val="fr-CH"/>
+        </w:rPr>
+      </w:pPr>
+      <w:r>
+        <w:rPr>
+          <w:lang w:val="fr-CH"/>
+        </w:rPr>
+        <w:t>Diagramme de séquence</w:t>
+      </w:r>
+    </w:p>
+    <w:p>
+      <w:pPr>
+        <w:pStyle w:val="BITTextkrper"/>
+        <w:jc w:val="center"/>
         <w:rPr>
           <w:lang w:val="fr-CH"/>
         </w:rPr>
@@ -6625,6 +6676,344 @@
     </w:p>
     <w:p>
       <w:pPr>
+        <w:pStyle w:val="BITTextkrper"/>
+        <w:rPr>
+          <w:lang w:val="fr-CH"/>
+        </w:rPr>
+      </w:pPr>
+      <w:r>
+        <w:rPr>
+          <w:lang w:val="fr-CH"/>
+        </w:rPr>
+        <w:lastRenderedPageBreak/>
+        <w:t>Diagramme d’activité</w:t>
+      </w:r>
+    </w:p>
+    <w:p>
+      <w:pPr>
+        <w:pStyle w:val="BITTextkrper"/>
+        <w:jc w:val="center"/>
+        <w:rPr>
+          <w:lang w:val="fr-CH"/>
+        </w:rPr>
+      </w:pPr>
+      <w:r>
+        <w:drawing>
+          <wp:inline distT="0" distB="0" distL="0" distR="0" wp14:anchorId="608DAA02" wp14:editId="74CC18EA">
+            <wp:extent cx="3699565" cy="5517270"/>
+            <wp:effectExtent l="0" t="0" r="0" b="7620"/>
+            <wp:docPr id="1529741735" name="Image 2"/>
+            <wp:cNvGraphicFramePr>
+              <a:graphicFrameLocks xmlns:a="http://schemas.openxmlformats.org/drawingml/2006/main" noChangeAspect="1"/>
+            </wp:cNvGraphicFramePr>
+            <a:graphic xmlns:a="http://schemas.openxmlformats.org/drawingml/2006/main">
+              <a:graphicData uri="http://schemas.openxmlformats.org/drawingml/2006/picture">
+                <pic:pic xmlns:pic="http://schemas.openxmlformats.org/drawingml/2006/picture">
+                  <pic:nvPicPr>
+                    <pic:cNvPr id="0" name="Picture 6"/>
+                    <pic:cNvPicPr>
+                      <a:picLocks noChangeAspect="1" noChangeArrowheads="1"/>
+                    </pic:cNvPicPr>
+                  </pic:nvPicPr>
+                  <pic:blipFill>
+                    <a:blip r:embed="rId14" cstate="print">
+                      <a:extLst>
+                        <a:ext uri="{28A0092B-C50C-407E-A947-70E740481C1C}">
+                          <a14:useLocalDpi xmlns:a14="http://schemas.microsoft.com/office/drawing/2010/main" val="0"/>
+                        </a:ext>
+                      </a:extLst>
+                    </a:blip>
+                    <a:srcRect/>
+                    <a:stretch>
+                      <a:fillRect/>
+                    </a:stretch>
+                  </pic:blipFill>
+                  <pic:spPr bwMode="auto">
+                    <a:xfrm>
+                      <a:off x="0" y="0"/>
+                      <a:ext cx="3709960" cy="5532773"/>
+                    </a:xfrm>
+                    <a:prstGeom prst="rect">
+                      <a:avLst/>
+                    </a:prstGeom>
+                    <a:noFill/>
+                    <a:ln>
+                      <a:noFill/>
+                    </a:ln>
+                  </pic:spPr>
+                </pic:pic>
+              </a:graphicData>
+            </a:graphic>
+          </wp:inline>
+        </w:drawing>
+      </w:r>
+    </w:p>
+    <w:p>
+      <w:pPr>
+        <w:pStyle w:val="BITTextkrper"/>
+        <w:jc w:val="center"/>
+        <w:rPr>
+          <w:lang w:val="fr-CH"/>
+        </w:rPr>
+      </w:pPr>
+    </w:p>
+    <w:p>
+      <w:pPr>
+        <w:pStyle w:val="BITTextkrper"/>
+        <w:jc w:val="center"/>
+        <w:rPr>
+          <w:lang w:val="fr-CH"/>
+        </w:rPr>
+      </w:pPr>
+    </w:p>
+    <w:p>
+      <w:pPr>
+        <w:pStyle w:val="BITTextkrper"/>
+        <w:jc w:val="center"/>
+        <w:rPr>
+          <w:lang w:val="fr-CH"/>
+        </w:rPr>
+      </w:pPr>
+    </w:p>
+    <w:p>
+      <w:pPr>
+        <w:pStyle w:val="BITTextkrper"/>
+        <w:jc w:val="center"/>
+        <w:rPr>
+          <w:lang w:val="fr-CH"/>
+        </w:rPr>
+      </w:pPr>
+    </w:p>
+    <w:p>
+      <w:pPr>
+        <w:pStyle w:val="BITTextkrper"/>
+        <w:jc w:val="center"/>
+        <w:rPr>
+          <w:lang w:val="fr-CH"/>
+        </w:rPr>
+      </w:pPr>
+    </w:p>
+    <w:p>
+      <w:pPr>
+        <w:pStyle w:val="BITTextkrper"/>
+        <w:jc w:val="center"/>
+        <w:rPr>
+          <w:lang w:val="fr-CH"/>
+        </w:rPr>
+      </w:pPr>
+    </w:p>
+    <w:p>
+      <w:pPr>
+        <w:pStyle w:val="BITTextkrper"/>
+        <w:jc w:val="center"/>
+        <w:rPr>
+          <w:lang w:val="fr-CH"/>
+        </w:rPr>
+      </w:pPr>
+    </w:p>
+    <w:p>
+      <w:pPr>
+        <w:pStyle w:val="BITTextkrper"/>
+        <w:jc w:val="center"/>
+        <w:rPr>
+          <w:lang w:val="fr-CH"/>
+        </w:rPr>
+      </w:pPr>
+    </w:p>
+    <w:p>
+      <w:pPr>
+        <w:pStyle w:val="BITTextkrper"/>
+        <w:jc w:val="center"/>
+        <w:rPr>
+          <w:lang w:val="fr-CH"/>
+        </w:rPr>
+      </w:pPr>
+    </w:p>
+    <w:p>
+      <w:pPr>
+        <w:pStyle w:val="BITTextkrper"/>
+        <w:rPr>
+          <w:lang w:val="fr-CH"/>
+        </w:rPr>
+      </w:pPr>
+      <w:proofErr w:type="spellStart"/>
+      <w:r>
+        <w:rPr>
+          <w:lang w:val="fr-CH"/>
+        </w:rPr>
+        <w:lastRenderedPageBreak/>
+        <w:t>Feature</w:t>
+      </w:r>
+      <w:proofErr w:type="spellEnd"/>
+      <w:r>
+        <w:rPr>
+          <w:lang w:val="fr-CH"/>
+        </w:rPr>
+        <w:t xml:space="preserve"> 3 : </w:t>
+      </w:r>
+      <w:r>
+        <w:rPr>
+          <w:lang w:val="fr-CH"/>
+        </w:rPr>
+        <w:t>générer un rapport de mission</w:t>
+      </w:r>
+    </w:p>
+    <w:p>
+      <w:pPr>
+        <w:pStyle w:val="BITTextkrper"/>
+        <w:rPr>
+          <w:lang w:val="fr-CH"/>
+        </w:rPr>
+      </w:pPr>
+      <w:r>
+        <w:rPr>
+          <w:lang w:val="fr-CH"/>
+        </w:rPr>
+        <w:t>Diagramme de séquence</w:t>
+      </w:r>
+    </w:p>
+    <w:p>
+      <w:pPr>
+        <w:pStyle w:val="BITTextkrper"/>
+        <w:jc w:val="center"/>
+        <w:rPr>
+          <w:lang w:val="fr-CH"/>
+        </w:rPr>
+      </w:pPr>
+      <w:r>
+        <w:rPr>
+          <w:lang w:val="fr-CH"/>
+        </w:rPr>
+        <w:drawing>
+          <wp:inline distT="0" distB="0" distL="0" distR="0" wp14:anchorId="69EF742A" wp14:editId="5E38E711">
+            <wp:extent cx="4045877" cy="3956538"/>
+            <wp:effectExtent l="0" t="0" r="0" b="6350"/>
+            <wp:docPr id="1021438401" name="Image 6"/>
+            <wp:cNvGraphicFramePr>
+              <a:graphicFrameLocks xmlns:a="http://schemas.openxmlformats.org/drawingml/2006/main" noChangeAspect="1"/>
+            </wp:cNvGraphicFramePr>
+            <a:graphic xmlns:a="http://schemas.openxmlformats.org/drawingml/2006/main">
+              <a:graphicData uri="http://schemas.openxmlformats.org/drawingml/2006/picture">
+                <pic:pic xmlns:pic="http://schemas.openxmlformats.org/drawingml/2006/picture">
+                  <pic:nvPicPr>
+                    <pic:cNvPr id="0" name="Picture 23"/>
+                    <pic:cNvPicPr>
+                      <a:picLocks noChangeAspect="1" noChangeArrowheads="1"/>
+                    </pic:cNvPicPr>
+                  </pic:nvPicPr>
+                  <pic:blipFill rotWithShape="1">
+                    <a:blip r:embed="rId15" cstate="print">
+                      <a:extLst>
+                        <a:ext uri="{28A0092B-C50C-407E-A947-70E740481C1C}">
+                          <a14:useLocalDpi xmlns:a14="http://schemas.microsoft.com/office/drawing/2010/main" val="0"/>
+                        </a:ext>
+                      </a:extLst>
+                    </a:blip>
+                    <a:srcRect l="304" t="-489" r="-304" b="21712"/>
+                    <a:stretch>
+                      <a:fillRect/>
+                    </a:stretch>
+                  </pic:blipFill>
+                  <pic:spPr bwMode="auto">
+                    <a:xfrm>
+                      <a:off x="0" y="0"/>
+                      <a:ext cx="4064754" cy="3974998"/>
+                    </a:xfrm>
+                    <a:prstGeom prst="rect">
+                      <a:avLst/>
+                    </a:prstGeom>
+                    <a:noFill/>
+                    <a:ln>
+                      <a:noFill/>
+                    </a:ln>
+                    <a:extLst>
+                      <a:ext uri="{53640926-AAD7-44D8-BBD7-CCE9431645EC}">
+                        <a14:shadowObscured xmlns:a14="http://schemas.microsoft.com/office/drawing/2010/main"/>
+                      </a:ext>
+                    </a:extLst>
+                  </pic:spPr>
+                </pic:pic>
+              </a:graphicData>
+            </a:graphic>
+          </wp:inline>
+        </w:drawing>
+      </w:r>
+    </w:p>
+    <w:p>
+      <w:pPr>
+        <w:pStyle w:val="BITTextkrper"/>
+        <w:rPr>
+          <w:lang w:val="fr-CH"/>
+        </w:rPr>
+      </w:pPr>
+      <w:r>
+        <w:rPr>
+          <w:lang w:val="fr-CH"/>
+        </w:rPr>
+        <w:t>Diagramme d’activité</w:t>
+      </w:r>
+    </w:p>
+    <w:p>
+      <w:pPr>
+        <w:pStyle w:val="BITTextkrper"/>
+        <w:jc w:val="center"/>
+        <w:rPr>
+          <w:lang w:val="fr-CH"/>
+        </w:rPr>
+      </w:pPr>
+      <w:r>
+        <w:drawing>
+          <wp:inline distT="0" distB="0" distL="0" distR="0" wp14:anchorId="06E70B9A" wp14:editId="5D032F42">
+            <wp:extent cx="2074984" cy="3319974"/>
+            <wp:effectExtent l="0" t="0" r="1905" b="0"/>
+            <wp:docPr id="1640570483" name="Image 4"/>
+            <wp:cNvGraphicFramePr>
+              <a:graphicFrameLocks xmlns:a="http://schemas.openxmlformats.org/drawingml/2006/main" noChangeAspect="1"/>
+            </wp:cNvGraphicFramePr>
+            <a:graphic xmlns:a="http://schemas.openxmlformats.org/drawingml/2006/main">
+              <a:graphicData uri="http://schemas.openxmlformats.org/drawingml/2006/picture">
+                <pic:pic xmlns:pic="http://schemas.openxmlformats.org/drawingml/2006/picture">
+                  <pic:nvPicPr>
+                    <pic:cNvPr id="0" name="Picture 13"/>
+                    <pic:cNvPicPr>
+                      <a:picLocks noChangeAspect="1" noChangeArrowheads="1"/>
+                    </pic:cNvPicPr>
+                  </pic:nvPicPr>
+                  <pic:blipFill>
+                    <a:blip r:embed="rId16" cstate="print">
+                      <a:extLst>
+                        <a:ext uri="{28A0092B-C50C-407E-A947-70E740481C1C}">
+                          <a14:useLocalDpi xmlns:a14="http://schemas.microsoft.com/office/drawing/2010/main" val="0"/>
+                        </a:ext>
+                      </a:extLst>
+                    </a:blip>
+                    <a:srcRect/>
+                    <a:stretch>
+                      <a:fillRect/>
+                    </a:stretch>
+                  </pic:blipFill>
+                  <pic:spPr bwMode="auto">
+                    <a:xfrm>
+                      <a:off x="0" y="0"/>
+                      <a:ext cx="2093678" cy="3349884"/>
+                    </a:xfrm>
+                    <a:prstGeom prst="rect">
+                      <a:avLst/>
+                    </a:prstGeom>
+                    <a:noFill/>
+                    <a:ln>
+                      <a:noFill/>
+                    </a:ln>
+                  </pic:spPr>
+                </pic:pic>
+              </a:graphicData>
+            </a:graphic>
+          </wp:inline>
+        </w:drawing>
+      </w:r>
+    </w:p>
+    <w:p>
+      <w:pPr>
         <w:pStyle w:val="Titre2"/>
       </w:pPr>
       <w:bookmarkStart w:id="28" w:name="_Toc219185373"/>
@@ -6680,7 +7069,7 @@
                     </pic:cNvPicPr>
                   </pic:nvPicPr>
                   <pic:blipFill>
-                    <a:blip r:embed="rId14">
+                    <a:blip r:embed="rId17">
                       <a:extLst>
                         <a:ext uri="{28A0092B-C50C-407E-A947-70E740481C1C}">
                           <a14:useLocalDpi xmlns:a14="http://schemas.microsoft.com/office/drawing/2010/main" val="0"/>
@@ -6774,7 +7163,7 @@
                     <pic:cNvPicPr/>
                   </pic:nvPicPr>
                   <pic:blipFill>
-                    <a:blip r:embed="rId15"/>
+                    <a:blip r:embed="rId18"/>
                     <a:stretch>
                       <a:fillRect/>
                     </a:stretch>
@@ -6834,7 +7223,7 @@
                     <pic:cNvPicPr/>
                   </pic:nvPicPr>
                   <pic:blipFill>
-                    <a:blip r:embed="rId16"/>
+                    <a:blip r:embed="rId19"/>
                     <a:stretch>
                       <a:fillRect/>
                     </a:stretch>
@@ -6985,7 +7374,7 @@
                     </pic:cNvPicPr>
                   </pic:nvPicPr>
                   <pic:blipFill>
-                    <a:blip r:embed="rId17">
+                    <a:blip r:embed="rId20">
                       <a:extLst>
                         <a:ext uri="{28A0092B-C50C-407E-A947-70E740481C1C}">
                           <a14:useLocalDpi xmlns:a14="http://schemas.microsoft.com/office/drawing/2010/main" val="0"/>
@@ -8470,7 +8859,7 @@
                     <pic:cNvPicPr/>
                   </pic:nvPicPr>
                   <pic:blipFill>
-                    <a:blip r:embed="rId18"/>
+                    <a:blip r:embed="rId21"/>
                     <a:stretch>
                       <a:fillRect/>
                     </a:stretch>
@@ -8656,13 +9045,27 @@
         <w:rPr>
           <w:lang w:val="fr-CH"/>
         </w:rPr>
-        <w:t xml:space="preserve">/ip/port), puis ouvre un </w:t>
+        <w:t>/</w:t>
       </w:r>
       <w:proofErr w:type="spellStart"/>
       <w:r>
         <w:rPr>
           <w:lang w:val="fr-CH"/>
         </w:rPr>
+        <w:t>ip</w:t>
+      </w:r>
+      <w:proofErr w:type="spellEnd"/>
+      <w:r>
+        <w:rPr>
+          <w:lang w:val="fr-CH"/>
+        </w:rPr>
+        <w:t xml:space="preserve">/port), puis ouvre un </w:t>
+      </w:r>
+      <w:proofErr w:type="spellStart"/>
+      <w:r>
+        <w:rPr>
+          <w:lang w:val="fr-CH"/>
+        </w:rPr>
         <w:t>DistanceSensor</w:t>
       </w:r>
       <w:proofErr w:type="spellEnd"/>
@@ -8754,7 +9157,21 @@
         <w:rPr>
           <w:lang w:val="fr-CH"/>
         </w:rPr>
-        <w:t xml:space="preserve">/ip/port que les moteurs, mais </w:t>
+        <w:t>/</w:t>
+      </w:r>
+      <w:proofErr w:type="spellStart"/>
+      <w:r>
+        <w:rPr>
+          <w:lang w:val="fr-CH"/>
+        </w:rPr>
+        <w:t>ip</w:t>
+      </w:r>
+      <w:proofErr w:type="spellEnd"/>
+      <w:r>
+        <w:rPr>
+          <w:lang w:val="fr-CH"/>
+        </w:rPr>
+        <w:t xml:space="preserve">/port que les moteurs, mais </w:t>
       </w:r>
       <w:proofErr w:type="spellStart"/>
       <w:r>
@@ -8959,7 +9376,21 @@
         <w:rPr>
           <w:lang w:val="fr-CH"/>
         </w:rPr>
-        <w:t xml:space="preserve"> les paramètres (server/ip/port/</w:t>
+        <w:t xml:space="preserve"> les paramètres (server/</w:t>
+      </w:r>
+      <w:proofErr w:type="spellStart"/>
+      <w:r>
+        <w:rPr>
+          <w:lang w:val="fr-CH"/>
+        </w:rPr>
+        <w:t>ip</w:t>
+      </w:r>
+      <w:proofErr w:type="spellEnd"/>
+      <w:r>
+        <w:rPr>
+          <w:lang w:val="fr-CH"/>
+        </w:rPr>
+        <w:t>/port/</w:t>
       </w:r>
       <w:proofErr w:type="spellStart"/>
       <w:r>
@@ -9982,7 +10413,21 @@
         <w:rPr>
           <w:lang w:val="fr-CH"/>
         </w:rPr>
-        <w:t>/ip/port incohérents entre sonar et moteurs, et l’erreur classique “</w:t>
+        <w:t>/</w:t>
+      </w:r>
+      <w:proofErr w:type="spellStart"/>
+      <w:r>
+        <w:rPr>
+          <w:lang w:val="fr-CH"/>
+        </w:rPr>
+        <w:t>ip</w:t>
+      </w:r>
+      <w:proofErr w:type="spellEnd"/>
+      <w:r>
+        <w:rPr>
+          <w:lang w:val="fr-CH"/>
+        </w:rPr>
+        <w:t>/port incohérents entre sonar et moteurs, et l’erreur classique “</w:t>
       </w:r>
       <w:proofErr w:type="spellStart"/>
       <w:r>
@@ -10108,7 +10553,7 @@
                     </pic:cNvPicPr>
                   </pic:nvPicPr>
                   <pic:blipFill>
-                    <a:blip r:embed="rId19">
+                    <a:blip r:embed="rId22">
                       <a:extLst>
                         <a:ext uri="{28A0092B-C50C-407E-A947-70E740481C1C}">
                           <a14:useLocalDpi xmlns:a14="http://schemas.microsoft.com/office/drawing/2010/main" val="0"/>
@@ -10249,7 +10694,15 @@
         <w:t xml:space="preserve"> connexion</w:t>
       </w:r>
       <w:r>
-        <w:t xml:space="preserve"> : journaliser les erreurs réseau/capteurs (codes, contexte : ip/port/</w:t>
+        <w:t xml:space="preserve"> : journaliser les erreurs réseau/capteurs (codes, contexte : </w:t>
+      </w:r>
+      <w:proofErr w:type="spellStart"/>
+      <w:r>
+        <w:t>ip</w:t>
+      </w:r>
+      <w:proofErr w:type="spellEnd"/>
+      <w:r>
+        <w:t>/port/</w:t>
       </w:r>
       <w:proofErr w:type="spellStart"/>
       <w:r>
@@ -10883,7 +11336,7 @@
         </w:rPr>
         <w:br/>
       </w:r>
-      <w:hyperlink r:id="rId20" w:history="1">
+      <w:hyperlink r:id="rId23" w:history="1">
         <w:r>
           <w:rPr>
             <w:rStyle w:val="Lienhypertexte"/>
@@ -10932,7 +11385,7 @@
         </w:rPr>
         <w:br/>
       </w:r>
-      <w:hyperlink r:id="rId21" w:history="1">
+      <w:hyperlink r:id="rId24" w:history="1">
         <w:r>
           <w:rPr>
             <w:rStyle w:val="Lienhypertexte"/>
@@ -10981,7 +11434,7 @@
         </w:rPr>
         <w:br/>
       </w:r>
-      <w:hyperlink r:id="rId22" w:history="1">
+      <w:hyperlink r:id="rId25" w:history="1">
         <w:r>
           <w:rPr>
             <w:rStyle w:val="Lienhypertexte"/>
@@ -11047,7 +11500,7 @@
         </w:rPr>
         <w:br/>
       </w:r>
-      <w:hyperlink r:id="rId23" w:history="1">
+      <w:hyperlink r:id="rId26" w:history="1">
         <w:r>
           <w:rPr>
             <w:rStyle w:val="Lienhypertexte"/>
@@ -11097,7 +11550,7 @@
         </w:rPr>
         <w:br/>
       </w:r>
-      <w:hyperlink r:id="rId24" w:history="1">
+      <w:hyperlink r:id="rId27" w:history="1">
         <w:r>
           <w:rPr>
             <w:rStyle w:val="Lienhypertexte"/>
@@ -11130,10 +11583,10 @@
       </w:r>
     </w:p>
     <w:sectPr>
-      <w:headerReference w:type="default" r:id="rId25"/>
-      <w:footerReference w:type="default" r:id="rId26"/>
-      <w:headerReference w:type="first" r:id="rId27"/>
-      <w:footerReference w:type="first" r:id="rId28"/>
+      <w:headerReference w:type="default" r:id="rId28"/>
+      <w:footerReference w:type="default" r:id="rId29"/>
+      <w:headerReference w:type="first" r:id="rId30"/>
+      <w:footerReference w:type="first" r:id="rId31"/>
       <w:pgSz w:w="11906" w:h="16838" w:code="9"/>
       <w:pgMar w:top="1861" w:right="1134" w:bottom="907" w:left="1701" w:header="851" w:footer="340" w:gutter="0"/>
       <w:cols w:space="708"/>
@@ -11230,6 +11683,7 @@
                 <w:dataBinding w:prefixMappings="xmlns:ns0='http://purl.org/dc/elements/1.1/' xmlns:ns1='http://schemas.openxmlformats.org/package/2006/metadata/core-properties' " w:xpath="/ns1:coreProperties[1]/ns0:creator[1]" w:storeItemID="{6C3C8BC8-F283-45AE-878A-BAB7291924A1}"/>
                 <w:text/>
               </w:sdtPr>
+              <w:sdtEndPr/>
               <w:sdtContent>
                 <w:tc>
                   <w:tcPr>
@@ -11355,7 +11809,7 @@
                   <w:rPr>
                     <w:lang w:val="fr-CH"/>
                   </w:rPr>
-                  <w:t>13.01.2026 11:28</w:t>
+                  <w:t>07.03.2026 14:51</w:t>
                 </w:r>
                 <w:r>
                   <w:rPr>
@@ -11533,6 +11987,7 @@
                 <w:dataBinding w:prefixMappings="xmlns:ns0='http://purl.org/dc/elements/1.1/' xmlns:ns1='http://schemas.openxmlformats.org/package/2006/metadata/core-properties' " w:xpath="/ns1:coreProperties[1]/ns0:creator[1]" w:storeItemID="{6C3C8BC8-F283-45AE-878A-BAB7291924A1}"/>
                 <w:text/>
               </w:sdtPr>
+              <w:sdtEndPr/>
               <w:sdtContent>
                 <w:tc>
                   <w:tcPr>
@@ -11652,7 +12107,7 @@
                   <w:rPr>
                     <w:lang w:val="fr-CH"/>
                   </w:rPr>
-                  <w:t>13.01.2026 11:28</w:t>
+                  <w:t>07.03.2026 14:51</w:t>
                 </w:r>
                 <w:r>
                   <w:rPr>
@@ -11746,6 +12201,7 @@
                 <w:dataBinding w:prefixMappings="xmlns:ns0='http://purl.org/dc/elements/1.1/' xmlns:ns1='http://schemas.openxmlformats.org/package/2006/metadata/core-properties' " w:xpath="/ns1:coreProperties[1]/ns0:creator[1]" w:storeItemID="{6C3C8BC8-F283-45AE-878A-BAB7291924A1}"/>
                 <w:text/>
               </w:sdtPr>
+              <w:sdtEndPr/>
               <w:sdtContent>
                 <w:tc>
                   <w:tcPr>
@@ -11865,7 +12321,7 @@
                   <w:rPr>
                     <w:lang w:val="fr-CH"/>
                   </w:rPr>
-                  <w:t>13.01.2026 11:28</w:t>
+                  <w:t>07.03.2026 14:51</w:t>
                 </w:r>
                 <w:r>
                   <w:rPr>
@@ -15517,7 +15973,7 @@
     <w:charset w:val="00"/>
     <w:family w:val="swiss"/>
     <w:pitch w:val="variable"/>
-    <w:sig w:usb0="E4002EFF" w:usb1="C200247B" w:usb2="00000009" w:usb3="00000000" w:csb0="000001FF" w:csb1="00000000"/>
+    <w:sig w:usb0="E4002EFF" w:usb1="C000247B" w:usb2="00000009" w:usb3="00000000" w:csb0="000001FF" w:csb1="00000000"/>
   </w:font>
   <w:font w:name="Tahoma">
     <w:panose1 w:val="020B0604030504040204"/>
@@ -15637,6 +16093,7 @@
     <w:rsid w:val="0082647C"/>
     <w:rsid w:val="00831DD5"/>
     <w:rsid w:val="008351A8"/>
+    <w:rsid w:val="00870605"/>
     <w:rsid w:val="0089532F"/>
     <w:rsid w:val="008E3367"/>
     <w:rsid w:val="008E6739"/>
@@ -15646,6 +16103,7 @@
     <w:rsid w:val="00A419DC"/>
     <w:rsid w:val="00A529A9"/>
     <w:rsid w:val="00A679B4"/>
+    <w:rsid w:val="00A717F0"/>
     <w:rsid w:val="00A8666E"/>
     <w:rsid w:val="00AC6E47"/>
     <w:rsid w:val="00AF6687"/>

</xml_diff>